<commit_message>
Figure nei riassunti: libreria figure_math.py (matplotlib), immagini nei Word con ![didascalia](...), esempi e documentazione
Co-Authored-By: Claude Sonnet 5.5 <noreply@anthropic.com>
</commit_message>
<xml_diff>
--- a/Riassunto Programmazione.docx
+++ b/Riassunto Programmazione.docx
@@ -10079,9 +10079,18 @@
         <w:t xml:space="preserve"> in cui la variabile n è allocata nello stack</w:t>
       </w:r>
       <w:r>
-        <w:t>. Passare l'indirizzo anziché il semplice valore consente a scanf() di individuare esattamente la cella di memoria da sovrascrivere con l'input fornito dall'utente.</w:t>
-      </w:r>
-    </w:p>
+        <w:t xml:space="preserve">. Passare l'indirizzo anziché il semplice valore consente a </w:t>
+      </w:r>
+      <w:proofErr w:type="gramStart"/>
+      <w:r>
+        <w:t>scanf(</w:t>
+      </w:r>
+      <w:proofErr w:type="gramEnd"/>
+      <w:r>
+        <w:t>) di individuare esattamente la cella di memoria da sovrascrivere con l'input fornito dall'utente.</w:t>
+      </w:r>
+    </w:p>
+    <w:p/>
     <w:p>
       <w:pPr>
         <w:pStyle w:val="Titolo1"/>

</xml_diff>

<commit_message>
Programmazione: capitoli 17-20 (booleane, intervalli, if, errori comuni); slide 03C/03D
Co-Authored-By: Claude Sonnet 5.5 <noreply@anthropic.com>
</commit_message>
<xml_diff>
--- a/Riassunto Programmazione.docx
+++ b/Riassunto Programmazione.docx
@@ -16450,6 +16450,4632 @@
         <w:t xml:space="preserve"> viene convertita in float soltanto l'espressione y, mentre x resta di tipo int (nella divisione il suo valore viene poi promosso a float dalle regole viste sopra, e z vale 3.333333). Il cast cambia il tipo dell'espressione durante la valutazione, non il tipo delle variabili coinvolte: x e y rimangono interi.</w:t>
       </w:r>
     </w:p>
+    <w:p>
+      <w:pPr>
+        <w:pStyle w:val="Titolo1"/>
+      </w:pPr>
+      <w:r>
+        <w:rPr>
+          <w:b/>
+          <w:color w:val="EE0000"/>
+        </w:rPr>
+        <w:t>Capitolo 17: Espressioni Booleane e Operatori Logici</w:t>
+      </w:r>
+    </w:p>
+    <w:p>
+      <w:pPr>
+        <w:pStyle w:val="Titolo2"/>
+      </w:pPr>
+      <w:r>
+        <w:rPr>
+          <w:b/>
+          <w:color w:val="E97132"/>
+        </w:rPr>
+        <w:t>Perché servono le condizioni</w:t>
+      </w:r>
+    </w:p>
+    <w:p>
+      <w:r>
+        <w:rPr/>
+        <w:t xml:space="preserve">Un programma non si limita a fare calcoli: deve anche prendere decisioni. Le </w:t>
+      </w:r>
+      <w:r>
+        <w:rPr>
+          <w:b/>
+        </w:rPr>
+        <w:t>condizioni</w:t>
+      </w:r>
+      <w:r>
+        <w:rPr/>
+        <w:t xml:space="preserve"> permettono di dire al computer "se succede questo, allora fai quello", e le </w:t>
+      </w:r>
+      <w:r>
+        <w:rPr>
+          <w:b/>
+        </w:rPr>
+        <w:t>espressioni booleane</w:t>
+      </w:r>
+      <w:r>
+        <w:rPr/>
+        <w:t xml:space="preserve"> sono il linguaggio con cui le scriviamo. Con le espressioni booleane traduciamo domande come "il numero di somme ripetute richieste è stato raggiunto?" (il contatore dell'algoritmo di moltiplicazione del capitolo 2), "l'input da tastiera è corretto?" oppure "lo studente ha superato l'esame?". Sono il ponte tra i dati numerici e le scelte logiche: senza di esse un programma sarebbe soltanto una lunga sequenza rigida di calcoli.</w:t>
+      </w:r>
+    </w:p>
+    <w:p>
+      <w:pPr>
+        <w:pStyle w:val="Titolo2"/>
+      </w:pPr>
+      <w:r>
+        <w:rPr>
+          <w:b/>
+          <w:color w:val="E97132"/>
+        </w:rPr>
+        <w:t>Operatori relazionali e logici in C</w:t>
+      </w:r>
+    </w:p>
+    <w:p>
+      <w:r>
+        <w:rPr/>
+        <w:t>Per scrivere le condizioni il C mette a disposizione operatori relazionali, che confrontano due valori, e operatori logici, che combinano condizioni. Accanto a ciascuno si indica la notazione matematica corrispondente:</w:t>
+      </w:r>
+    </w:p>
+    <w:p>
+      <w:pPr>
+        <w:numPr>
+          <w:ilvl w:val="0"/>
+          <w:numId w:val="1"/>
+        </w:numPr>
+      </w:pPr>
+      <w:r>
+        <w:rPr>
+          <w:b/>
+        </w:rPr>
+        <w:t>==</w:t>
+      </w:r>
+      <w:r>
+        <w:rPr/>
+        <w:t xml:space="preserve"> (uguaglianza, x = y in matematica): </w:t>
+      </w:r>
+      <w:r>
+        <w:rPr>
+          <w:rFonts w:ascii="Consolas" w:hAnsi="Consolas" w:cs="Consolas"/>
+        </w:rPr>
+        <w:t>x == y</w:t>
+      </w:r>
+      <w:r>
+        <w:rPr/>
+        <w:t xml:space="preserve"> vale 1 se i due valori sono uguali, altrimenti 0;</w:t>
+      </w:r>
+    </w:p>
+    <w:p>
+      <w:pPr>
+        <w:numPr>
+          <w:ilvl w:val="0"/>
+          <w:numId w:val="1"/>
+        </w:numPr>
+      </w:pPr>
+      <w:r>
+        <w:rPr>
+          <w:b/>
+        </w:rPr>
+        <w:t>!=</w:t>
+      </w:r>
+      <w:r>
+        <w:rPr/>
+        <w:t xml:space="preserve"> (diversità, x ≠ y): </w:t>
+      </w:r>
+      <w:r>
+        <w:rPr>
+          <w:rFonts w:ascii="Consolas" w:hAnsi="Consolas" w:cs="Consolas"/>
+        </w:rPr>
+        <w:t>x != y</w:t>
+      </w:r>
+      <w:r>
+        <w:rPr/>
+        <w:t xml:space="preserve"> vale 1 se sono diversi, altrimenti 0;</w:t>
+      </w:r>
+    </w:p>
+    <w:p>
+      <w:pPr>
+        <w:numPr>
+          <w:ilvl w:val="0"/>
+          <w:numId w:val="1"/>
+        </w:numPr>
+      </w:pPr>
+      <w:r>
+        <w:rPr>
+          <w:b/>
+        </w:rPr>
+        <w:t>&gt;</w:t>
+      </w:r>
+      <w:r>
+        <w:rPr/>
+        <w:t xml:space="preserve"> e </w:t>
+      </w:r>
+      <w:r>
+        <w:rPr>
+          <w:b/>
+        </w:rPr>
+        <w:t>&lt;</w:t>
+      </w:r>
+      <w:r>
+        <w:rPr/>
+        <w:t xml:space="preserve"> (maggiore e minore): </w:t>
+      </w:r>
+      <w:r>
+        <w:rPr>
+          <w:rFonts w:ascii="Consolas" w:hAnsi="Consolas" w:cs="Consolas"/>
+        </w:rPr>
+        <w:t>x &gt; y</w:t>
+      </w:r>
+      <w:r>
+        <w:rPr/>
+        <w:t xml:space="preserve"> e </w:t>
+      </w:r>
+      <w:r>
+        <w:rPr>
+          <w:rFonts w:ascii="Consolas" w:hAnsi="Consolas" w:cs="Consolas"/>
+        </w:rPr>
+        <w:t>x &lt; y</w:t>
+      </w:r>
+      <w:r>
+        <w:rPr/>
+        <w:t xml:space="preserve"> valgono 1 se la relazione è vera, altrimenti 0;</w:t>
+      </w:r>
+    </w:p>
+    <w:p>
+      <w:pPr>
+        <w:numPr>
+          <w:ilvl w:val="0"/>
+          <w:numId w:val="1"/>
+        </w:numPr>
+      </w:pPr>
+      <w:r>
+        <w:rPr>
+          <w:b/>
+        </w:rPr>
+        <w:t>&gt;=</w:t>
+      </w:r>
+      <w:r>
+        <w:rPr/>
+        <w:t xml:space="preserve"> e </w:t>
+      </w:r>
+      <w:r>
+        <w:rPr>
+          <w:b/>
+        </w:rPr>
+        <w:t>&lt;=</w:t>
+      </w:r>
+      <w:r>
+        <w:rPr/>
+        <w:t xml:space="preserve"> (maggiore o uguale, minore o uguale, x ≥ y e x ≤ y): valgono 1 se la relazione è vera, altrimenti 0;</w:t>
+      </w:r>
+    </w:p>
+    <w:p>
+      <w:pPr>
+        <w:numPr>
+          <w:ilvl w:val="0"/>
+          <w:numId w:val="1"/>
+        </w:numPr>
+      </w:pPr>
+      <w:r>
+        <w:rPr>
+          <w:b/>
+        </w:rPr>
+        <w:t>&amp;&amp;</w:t>
+      </w:r>
+      <w:r>
+        <w:rPr/>
+        <w:t xml:space="preserve"> (AND, congiunzione, b ∧ c): </w:t>
+      </w:r>
+      <w:r>
+        <w:rPr>
+          <w:rFonts w:ascii="Consolas" w:hAnsi="Consolas" w:cs="Consolas"/>
+        </w:rPr>
+        <w:t>x &gt; 0 &amp;&amp; y &gt; 0</w:t>
+      </w:r>
+      <w:r>
+        <w:rPr/>
+        <w:t xml:space="preserve"> vale 1 se entrambe le condizioni sono vere;</w:t>
+      </w:r>
+    </w:p>
+    <w:p>
+      <w:pPr>
+        <w:numPr>
+          <w:ilvl w:val="0"/>
+          <w:numId w:val="1"/>
+        </w:numPr>
+      </w:pPr>
+      <w:r>
+        <w:rPr>
+          <w:b/>
+        </w:rPr>
+        <w:t>||</w:t>
+      </w:r>
+      <w:r>
+        <w:rPr/>
+        <w:t xml:space="preserve"> (OR, disgiunzione, b ∨ c): </w:t>
+      </w:r>
+      <w:r>
+        <w:rPr>
+          <w:rFonts w:ascii="Consolas" w:hAnsi="Consolas" w:cs="Consolas"/>
+        </w:rPr>
+        <w:t>x == 0 || y == 0</w:t>
+      </w:r>
+      <w:r>
+        <w:rPr/>
+        <w:t xml:space="preserve"> vale 1 se almeno una delle due è vera;</w:t>
+      </w:r>
+    </w:p>
+    <w:p>
+      <w:pPr>
+        <w:numPr>
+          <w:ilvl w:val="0"/>
+          <w:numId w:val="1"/>
+        </w:numPr>
+      </w:pPr>
+      <w:r>
+        <w:rPr>
+          <w:b/>
+        </w:rPr>
+        <w:t>!</w:t>
+      </w:r>
+      <w:r>
+        <w:rPr/>
+        <w:t xml:space="preserve"> (NOT, negazione, ¬b): </w:t>
+      </w:r>
+      <w:r>
+        <w:rPr>
+          <w:rFonts w:ascii="Consolas" w:hAnsi="Consolas" w:cs="Consolas"/>
+        </w:rPr>
+        <w:t>!(x &gt; 0)</w:t>
+      </w:r>
+      <w:r>
+        <w:rPr/>
+        <w:t xml:space="preserve"> inverte il valore logico della condizione.</w:t>
+      </w:r>
+    </w:p>
+    <w:p>
+      <w:r>
+        <w:rPr/>
+        <w:t xml:space="preserve">Il risultato di ogni espressione di questo tipo è quindi un numero, 1 per vero e 0 per falso. Gli operatori relazionali si usano spesso fra numeri: </w:t>
+      </w:r>
+      <w:r>
+        <w:rPr>
+          <w:rFonts w:ascii="Consolas" w:hAnsi="Consolas" w:cs="Consolas"/>
+        </w:rPr>
+        <w:t>contatore != n</w:t>
+      </w:r>
+      <w:r>
+        <w:rPr/>
+        <w:t xml:space="preserve"> verifica se le ripetizioni sono completate, </w:t>
+      </w:r>
+      <w:r>
+        <w:rPr>
+          <w:rFonts w:ascii="Consolas" w:hAnsi="Consolas" w:cs="Consolas"/>
+        </w:rPr>
+        <w:t>pinInserito == pinCorretto</w:t>
+      </w:r>
+      <w:r>
+        <w:rPr/>
+        <w:t xml:space="preserve"> confronta due codici, </w:t>
+      </w:r>
+      <w:r>
+        <w:rPr>
+          <w:rFonts w:ascii="Consolas" w:hAnsi="Consolas" w:cs="Consolas"/>
+        </w:rPr>
+        <w:t>temperatura &lt;= limiteMax</w:t>
+      </w:r>
+      <w:r>
+        <w:rPr/>
+        <w:t xml:space="preserve"> controlla un limite e </w:t>
+      </w:r>
+      <w:r>
+        <w:rPr>
+          <w:rFonts w:ascii="Consolas" w:hAnsi="Consolas" w:cs="Consolas"/>
+        </w:rPr>
+        <w:t>voto &gt;= 18</w:t>
+      </w:r>
+      <w:r>
+        <w:rPr/>
+        <w:t xml:space="preserve"> verifica la sufficienza all'esame.</w:t>
+      </w:r>
+    </w:p>
+    <w:p>
+      <w:r>
+        <w:rPr/>
+        <w:t xml:space="preserve">C'è un errore da non commettere mai: </w:t>
+      </w:r>
+      <w:r>
+        <w:rPr>
+          <w:b/>
+        </w:rPr>
+        <w:t>==</w:t>
+      </w:r>
+      <w:r>
+        <w:rPr/>
+        <w:t xml:space="preserve"> è l'uguaglianza, mentre </w:t>
+      </w:r>
+      <w:r>
+        <w:rPr>
+          <w:b/>
+        </w:rPr>
+        <w:t>=</w:t>
+      </w:r>
+      <w:r>
+        <w:rPr/>
+        <w:t xml:space="preserve"> è l'assegnamento (capitolo 8). Scrivere </w:t>
+      </w:r>
+      <w:r>
+        <w:rPr>
+          <w:rFonts w:ascii="Consolas" w:hAnsi="Consolas" w:cs="Consolas"/>
+        </w:rPr>
+        <w:t>x = y</w:t>
+      </w:r>
+      <w:r>
+        <w:rPr/>
+        <w:t xml:space="preserve"> dentro una condizione non confronta due valori: copia y in x, e l'espressione vale il valore copiato (se ne vedrà la conseguenza nel capitolo 20).</w:t>
+      </w:r>
+    </w:p>
+    <w:p>
+      <w:pPr>
+        <w:pStyle w:val="Titolo2"/>
+      </w:pPr>
+      <w:r>
+        <w:rPr>
+          <w:b/>
+          <w:color w:val="E97132"/>
+        </w:rPr>
+        <w:t>Il tipo bool</w:t>
+      </w:r>
+    </w:p>
+    <w:p>
+      <w:r>
+        <w:rPr/>
+        <w:t xml:space="preserve">Le condizioni, nella logica di Boole, possono assumere solo due valori: </w:t>
+      </w:r>
+      <w:r>
+        <w:rPr>
+          <w:b/>
+        </w:rPr>
+        <w:t>true</w:t>
+      </w:r>
+      <w:r>
+        <w:rPr/>
+        <w:t xml:space="preserve"> (vero) e </w:t>
+      </w:r>
+      <w:r>
+        <w:rPr>
+          <w:b/>
+        </w:rPr>
+        <w:t>false</w:t>
+      </w:r>
+      <w:r>
+        <w:rPr/>
+        <w:t xml:space="preserve"> (falso). La logica di Boole, o algebra booleana, è il sistema matematico basato su questi due valori e sugli operatori fondamentali AND, OR e NOT, alla base dei circuiti digitali (le porte logiche di Fondamenti dell'Informatica) e della programmazione.</w:t>
+      </w:r>
+    </w:p>
+    <w:p>
+      <w:r>
+        <w:rPr/>
+        <w:t xml:space="preserve">Storicamente il C non aveva un tipo booleano fra i tipi primitivi, e si usavano gli interi con questa interpretazione: </w:t>
+      </w:r>
+      <w:r>
+        <w:rPr>
+          <w:b/>
+        </w:rPr>
+        <w:t>0 è falso, un valore diverso da 0 è vero</w:t>
+      </w:r>
+      <w:r>
+        <w:rPr/>
+        <w:t xml:space="preserve">. Nel C moderno (dal C99) esiste l'header </w:t>
+      </w:r>
+      <w:r>
+        <w:rPr>
+          <w:rFonts w:ascii="Consolas" w:hAnsi="Consolas" w:cs="Consolas"/>
+        </w:rPr>
+        <w:t>&lt;stdbool.h&gt;</w:t>
+      </w:r>
+      <w:r>
+        <w:rPr/>
+        <w:t>, che introduce:</w:t>
+      </w:r>
+    </w:p>
+    <w:p>
+      <w:pPr>
+        <w:numPr>
+          <w:ilvl w:val="0"/>
+          <w:numId w:val="1"/>
+        </w:numPr>
+      </w:pPr>
+      <w:r>
+        <w:rPr/>
+        <w:t xml:space="preserve">il tipo </w:t>
+      </w:r>
+      <w:r>
+        <w:rPr>
+          <w:b/>
+        </w:rPr>
+        <w:t>bool</w:t>
+      </w:r>
+      <w:r>
+        <w:rPr/>
+        <w:t>, simile a int ma che chiarisce che la variabile è booleana;</w:t>
+      </w:r>
+    </w:p>
+    <w:p>
+      <w:pPr>
+        <w:numPr>
+          <w:ilvl w:val="0"/>
+          <w:numId w:val="1"/>
+        </w:numPr>
+      </w:pPr>
+      <w:r>
+        <w:rPr/>
+        <w:t xml:space="preserve">le costanti </w:t>
+      </w:r>
+      <w:r>
+        <w:rPr>
+          <w:b/>
+        </w:rPr>
+        <w:t>true</w:t>
+      </w:r>
+      <w:r>
+        <w:rPr/>
+        <w:t xml:space="preserve"> e </w:t>
+      </w:r>
+      <w:r>
+        <w:rPr>
+          <w:b/>
+        </w:rPr>
+        <w:t>false</w:t>
+      </w:r>
+      <w:r>
+        <w:rPr/>
+        <w:t>.</w:t>
+      </w:r>
+    </w:p>
+    <w:p>
+      <w:r>
+        <w:rPr/>
+        <w:t>Nel corso si userà il C moderno dove possibile. Nello schema della memoria una variabile booleana si rappresenta come un singolo bit, 0 oppure 1. Nel programma seguente ci sono due int, x e y, e un bool b inizializzato a false: nello schema b occupa un solo bit, che vale 0.</w:t>
+      </w:r>
+    </w:p>
+    <w:p>
+      <w:pPr>
+        <w:spacing w:after="0" w:before="0" w:line="240" w:lineRule="auto"/>
+      </w:pPr>
+      <w:r>
+        <w:rPr>
+          <w:rFonts w:ascii="Consolas" w:hAnsi="Consolas" w:cs="Consolas"/>
+          <w:sz w:val="17"/>
+        </w:rPr>
+        <w:t>#include &lt;stdio.h&gt;</w:t>
+      </w:r>
+    </w:p>
+    <w:p>
+      <w:pPr>
+        <w:spacing w:after="0" w:before="0" w:line="240" w:lineRule="auto"/>
+      </w:pPr>
+      <w:r>
+        <w:rPr>
+          <w:rFonts w:ascii="Consolas" w:hAnsi="Consolas" w:cs="Consolas"/>
+          <w:sz w:val="17"/>
+        </w:rPr>
+        <w:t>#include &lt;stdbool.h&gt;</w:t>
+      </w:r>
+    </w:p>
+    <w:p>
+      <w:pPr>
+        <w:spacing w:after="0" w:before="0" w:line="240" w:lineRule="auto"/>
+      </w:pPr>
+      <w:r>
+        <w:rPr>
+          <w:rFonts w:ascii="Consolas" w:hAnsi="Consolas" w:cs="Consolas"/>
+          <w:sz w:val="17"/>
+        </w:rPr>
+        <w:t>int main(void) {</w:t>
+      </w:r>
+    </w:p>
+    <w:p>
+      <w:pPr>
+        <w:spacing w:after="0" w:before="0" w:line="240" w:lineRule="auto"/>
+      </w:pPr>
+      <w:r>
+        <w:rPr>
+          <w:rFonts w:ascii="Consolas" w:hAnsi="Consolas" w:cs="Consolas"/>
+          <w:sz w:val="17"/>
+        </w:rPr>
+        <w:t xml:space="preserve">    int x = 1;</w:t>
+      </w:r>
+    </w:p>
+    <w:p>
+      <w:pPr>
+        <w:spacing w:after="0" w:before="0" w:line="240" w:lineRule="auto"/>
+      </w:pPr>
+      <w:r>
+        <w:rPr>
+          <w:rFonts w:ascii="Consolas" w:hAnsi="Consolas" w:cs="Consolas"/>
+          <w:sz w:val="17"/>
+        </w:rPr>
+        <w:t xml:space="preserve">    bool b = false;</w:t>
+      </w:r>
+    </w:p>
+    <w:p>
+      <w:pPr>
+        <w:spacing w:after="0" w:before="0" w:line="240" w:lineRule="auto"/>
+      </w:pPr>
+      <w:r>
+        <w:rPr>
+          <w:rFonts w:ascii="Consolas" w:hAnsi="Consolas" w:cs="Consolas"/>
+          <w:sz w:val="17"/>
+        </w:rPr>
+        <w:t xml:space="preserve">    int y = 2;</w:t>
+      </w:r>
+    </w:p>
+    <w:p>
+      <w:pPr>
+        <w:spacing w:after="0" w:before="0" w:line="240" w:lineRule="auto"/>
+      </w:pPr>
+      <w:r>
+        <w:rPr>
+          <w:rFonts w:ascii="Consolas" w:hAnsi="Consolas" w:cs="Consolas"/>
+          <w:sz w:val="17"/>
+        </w:rPr>
+        <w:t>}</w:t>
+      </w:r>
+    </w:p>
+    <w:p/>
+    <w:p>
+      <w:r>
+        <w:rPr/>
+        <w:t xml:space="preserve">Una variabile booleana può memorizzare il risultato della valutazione di una condizione. Nel programma seguente </w:t>
+      </w:r>
+      <w:r>
+        <w:rPr>
+          <w:rFonts w:ascii="Consolas" w:hAnsi="Consolas" w:cs="Consolas"/>
+        </w:rPr>
+        <w:t>superato</w:t>
+      </w:r>
+      <w:r>
+        <w:rPr/>
+        <w:t xml:space="preserve"> vale 1 perché 25 è maggiore o uguale a 18:</w:t>
+      </w:r>
+    </w:p>
+    <w:p>
+      <w:pPr>
+        <w:spacing w:after="0" w:before="0" w:line="240" w:lineRule="auto"/>
+      </w:pPr>
+      <w:r>
+        <w:rPr>
+          <w:rFonts w:ascii="Consolas" w:hAnsi="Consolas" w:cs="Consolas"/>
+          <w:sz w:val="17"/>
+        </w:rPr>
+        <w:t>#include &lt;stdio.h&gt;</w:t>
+      </w:r>
+    </w:p>
+    <w:p>
+      <w:pPr>
+        <w:spacing w:after="0" w:before="0" w:line="240" w:lineRule="auto"/>
+      </w:pPr>
+      <w:r>
+        <w:rPr>
+          <w:rFonts w:ascii="Consolas" w:hAnsi="Consolas" w:cs="Consolas"/>
+          <w:sz w:val="17"/>
+        </w:rPr>
+        <w:t>#include &lt;stdbool.h&gt;</w:t>
+      </w:r>
+    </w:p>
+    <w:p>
+      <w:pPr>
+        <w:spacing w:after="0" w:before="0" w:line="240" w:lineRule="auto"/>
+      </w:pPr>
+      <w:r>
+        <w:rPr>
+          <w:rFonts w:ascii="Consolas" w:hAnsi="Consolas" w:cs="Consolas"/>
+          <w:sz w:val="17"/>
+        </w:rPr>
+        <w:t>int main(void) {</w:t>
+      </w:r>
+    </w:p>
+    <w:p>
+      <w:pPr>
+        <w:spacing w:after="0" w:before="0" w:line="240" w:lineRule="auto"/>
+      </w:pPr>
+      <w:r>
+        <w:rPr>
+          <w:rFonts w:ascii="Consolas" w:hAnsi="Consolas" w:cs="Consolas"/>
+          <w:sz w:val="17"/>
+        </w:rPr>
+        <w:t xml:space="preserve">    int votoScritto = 25;</w:t>
+      </w:r>
+    </w:p>
+    <w:p>
+      <w:pPr>
+        <w:spacing w:after="0" w:before="0" w:line="240" w:lineRule="auto"/>
+      </w:pPr>
+      <w:r>
+        <w:rPr>
+          <w:rFonts w:ascii="Consolas" w:hAnsi="Consolas" w:cs="Consolas"/>
+          <w:sz w:val="17"/>
+        </w:rPr>
+        <w:t xml:space="preserve">    int sogliaSuff = 18;</w:t>
+      </w:r>
+    </w:p>
+    <w:p>
+      <w:pPr>
+        <w:spacing w:after="0" w:before="0" w:line="240" w:lineRule="auto"/>
+      </w:pPr>
+      <w:r>
+        <w:rPr>
+          <w:rFonts w:ascii="Consolas" w:hAnsi="Consolas" w:cs="Consolas"/>
+          <w:sz w:val="17"/>
+        </w:rPr>
+        <w:t xml:space="preserve">    bool superato = votoScritto &gt;= sogliaSuff;</w:t>
+      </w:r>
+    </w:p>
+    <w:p>
+      <w:pPr>
+        <w:spacing w:after="0" w:before="0" w:line="240" w:lineRule="auto"/>
+      </w:pPr>
+      <w:r>
+        <w:rPr>
+          <w:rFonts w:ascii="Consolas" w:hAnsi="Consolas" w:cs="Consolas"/>
+          <w:sz w:val="17"/>
+        </w:rPr>
+        <w:t xml:space="preserve">    printf("Lo studente supera l'esame? %d\n", superato);</w:t>
+      </w:r>
+    </w:p>
+    <w:p>
+      <w:pPr>
+        <w:spacing w:after="0" w:before="0" w:line="240" w:lineRule="auto"/>
+      </w:pPr>
+      <w:r>
+        <w:rPr>
+          <w:rFonts w:ascii="Consolas" w:hAnsi="Consolas" w:cs="Consolas"/>
+          <w:sz w:val="17"/>
+        </w:rPr>
+        <w:t>}</w:t>
+      </w:r>
+    </w:p>
+    <w:p/>
+    <w:p>
+      <w:r>
+        <w:rPr/>
+        <w:t xml:space="preserve">L'output è </w:t>
+      </w:r>
+      <w:r>
+        <w:rPr>
+          <w:rFonts w:ascii="Consolas" w:hAnsi="Consolas" w:cs="Consolas"/>
+        </w:rPr>
+        <w:t>Lo studente supera l'esame? 1</w:t>
+      </w:r>
+      <w:r>
+        <w:rPr/>
+        <w:t xml:space="preserve">. Per il tipo bool </w:t>
+      </w:r>
+      <w:r>
+        <w:rPr>
+          <w:b/>
+        </w:rPr>
+        <w:t>non esiste uno specificatore di formato dedicato</w:t>
+      </w:r>
+      <w:r>
+        <w:rPr/>
+        <w:t>: si usa %d, come per gli interi, e quindi viene stampato 0 oppure 1.</w:t>
+      </w:r>
+    </w:p>
+    <w:p>
+      <w:pPr>
+        <w:pStyle w:val="Titolo2"/>
+      </w:pPr>
+      <w:r>
+        <w:rPr>
+          <w:b/>
+          <w:color w:val="E97132"/>
+        </w:rPr>
+        <w:t>Combinare più condizioni</w:t>
+      </w:r>
+    </w:p>
+    <w:p>
+      <w:r>
+        <w:rPr/>
+        <w:t>Nei programmi spesso non basta verificare una sola condizione: occorre stabilire il rapporto logico fra più condizioni contemporaneamente. Le condizioni si combinano con tre operatori:</w:t>
+      </w:r>
+    </w:p>
+    <w:p>
+      <w:pPr>
+        <w:numPr>
+          <w:ilvl w:val="0"/>
+          <w:numId w:val="1"/>
+        </w:numPr>
+      </w:pPr>
+      <w:r>
+        <w:rPr/>
+        <w:t xml:space="preserve">la </w:t>
+      </w:r>
+      <w:r>
+        <w:rPr>
+          <w:b/>
+        </w:rPr>
+        <w:t>congiunzione</w:t>
+      </w:r>
+      <w:r>
+        <w:rPr/>
+        <w:t xml:space="preserve"> </w:t>
+      </w:r>
+      <w:r>
+        <w:rPr>
+          <w:rFonts w:ascii="Consolas" w:hAnsi="Consolas" w:cs="Consolas"/>
+        </w:rPr>
+        <w:t>condizione1 &amp;&amp; condizione2</w:t>
+      </w:r>
+      <w:r>
+        <w:rPr/>
+        <w:t>, vera se entrambe le condizioni sono vere;</w:t>
+      </w:r>
+    </w:p>
+    <w:p>
+      <w:pPr>
+        <w:numPr>
+          <w:ilvl w:val="0"/>
+          <w:numId w:val="1"/>
+        </w:numPr>
+      </w:pPr>
+      <w:r>
+        <w:rPr/>
+        <w:t xml:space="preserve">la </w:t>
+      </w:r>
+      <w:r>
+        <w:rPr>
+          <w:b/>
+        </w:rPr>
+        <w:t>disgiunzione</w:t>
+      </w:r>
+      <w:r>
+        <w:rPr/>
+        <w:t xml:space="preserve"> </w:t>
+      </w:r>
+      <w:r>
+        <w:rPr>
+          <w:rFonts w:ascii="Consolas" w:hAnsi="Consolas" w:cs="Consolas"/>
+        </w:rPr>
+        <w:t>condizione1 || condizione2</w:t>
+      </w:r>
+      <w:r>
+        <w:rPr/>
+        <w:t>, vera se almeno una è vera;</w:t>
+      </w:r>
+    </w:p>
+    <w:p>
+      <w:pPr>
+        <w:numPr>
+          <w:ilvl w:val="0"/>
+          <w:numId w:val="1"/>
+        </w:numPr>
+      </w:pPr>
+      <w:r>
+        <w:rPr/>
+        <w:t xml:space="preserve">la </w:t>
+      </w:r>
+      <w:r>
+        <w:rPr>
+          <w:b/>
+        </w:rPr>
+        <w:t>negazione</w:t>
+      </w:r>
+      <w:r>
+        <w:rPr/>
+        <w:t xml:space="preserve"> </w:t>
+      </w:r>
+      <w:r>
+        <w:rPr>
+          <w:rFonts w:ascii="Consolas" w:hAnsi="Consolas" w:cs="Consolas"/>
+        </w:rPr>
+        <w:t>!condizione</w:t>
+      </w:r>
+      <w:r>
+        <w:rPr/>
+        <w:t>, che dà l'opposto del valore della condizione.</w:t>
+      </w:r>
+    </w:p>
+    <w:p>
+      <w:r>
+        <w:rPr/>
+        <w:t>Alcuni esempi tradotti in C:</w:t>
+      </w:r>
+    </w:p>
+    <w:p>
+      <w:pPr>
+        <w:spacing w:after="0" w:before="0" w:line="240" w:lineRule="auto"/>
+      </w:pPr>
+      <w:r>
+        <w:rPr>
+          <w:rFonts w:ascii="Consolas" w:hAnsi="Consolas" w:cs="Consolas"/>
+          <w:sz w:val="17"/>
+        </w:rPr>
+        <w:t>bool login = (numTentativi &lt; 3) &amp;&amp; !accountBloccato;       // il login è possibile se i tentativi sono meno di 3 e l'account non è bloccato</w:t>
+      </w:r>
+    </w:p>
+    <w:p>
+      <w:pPr>
+        <w:spacing w:after="0" w:before="0" w:line="240" w:lineRule="auto"/>
+      </w:pPr>
+      <w:r>
+        <w:rPr>
+          <w:rFonts w:ascii="Consolas" w:hAnsi="Consolas" w:cs="Consolas"/>
+          <w:sz w:val="17"/>
+        </w:rPr>
+        <w:t>bool riscaldamento = (temperatura &lt; 18) &amp;&amp; termostatoOn;    // il riscaldamento si accende se fa freddo e il termostato è attivo</w:t>
+      </w:r>
+    </w:p>
+    <w:p>
+      <w:pPr>
+        <w:spacing w:after="0" w:before="0" w:line="240" w:lineRule="auto"/>
+      </w:pPr>
+      <w:r>
+        <w:rPr>
+          <w:rFonts w:ascii="Consolas" w:hAnsi="Consolas" w:cs="Consolas"/>
+          <w:sz w:val="17"/>
+        </w:rPr>
+        <w:t>bool sconto = (eta &lt; 12) || tesserato;                      // lo sconto spetta ai minori di 12 anni oppure ai tesserati</w:t>
+      </w:r>
+    </w:p>
+    <w:p>
+      <w:pPr>
+        <w:spacing w:after="0" w:before="0" w:line="240" w:lineRule="auto"/>
+      </w:pPr>
+      <w:r>
+        <w:rPr>
+          <w:rFonts w:ascii="Consolas" w:hAnsi="Consolas" w:cs="Consolas"/>
+          <w:sz w:val="17"/>
+        </w:rPr>
+        <w:t>bool ventolaAccesa = (temperatura &gt;= 28) || modoManuale;    // la ventola si accende se fa caldo oppure è in modo manuale</w:t>
+      </w:r>
+    </w:p>
+    <w:p/>
+    <w:p>
+      <w:pPr>
+        <w:pStyle w:val="Titolo2"/>
+      </w:pPr>
+      <w:r>
+        <w:rPr>
+          <w:b/>
+          <w:color w:val="E97132"/>
+        </w:rPr>
+        <w:t>Le tavole di verità</w:t>
+      </w:r>
+    </w:p>
+    <w:p>
+      <w:r>
+        <w:rPr/>
+        <w:t xml:space="preserve">Gli operatori si definiscono con le loro tavole di verità, le stesse viste in Fondamenti dell'Informatica per i connettivi logici. L'operatore </w:t>
+      </w:r>
+      <w:r>
+        <w:rPr>
+          <w:b/>
+        </w:rPr>
+        <w:t>AND</w:t>
+      </w:r>
+      <w:r>
+        <w:rPr/>
+        <w:t xml:space="preserve"> restituisce vero (1) solo se entrambe le condizioni sono vere, e falso (0) in tutti gli altri casi. L'operatore </w:t>
+      </w:r>
+      <w:r>
+        <w:rPr>
+          <w:b/>
+        </w:rPr>
+        <w:t>OR</w:t>
+      </w:r>
+      <w:r>
+        <w:rPr/>
+        <w:t xml:space="preserve"> restituisce vero se almeno una delle due condizioni è vera, ed è falso solo se entrambe sono false. L'operatore </w:t>
+      </w:r>
+      <w:r>
+        <w:rPr>
+          <w:b/>
+        </w:rPr>
+        <w:t>NOT</w:t>
+      </w:r>
+      <w:r>
+        <w:rPr/>
+        <w:t xml:space="preserve"> restituisce l'opposto della condizione: vera diventa falsa e falsa diventa vera.</w:t>
+      </w:r>
+    </w:p>
+    <w:p>
+      <w:pPr>
+        <w:keepNext/>
+        <w:jc w:val="center"/>
+      </w:pPr>
+      <w:r>
+        <w:drawing>
+          <wp:inline xmlns:a="http://schemas.openxmlformats.org/drawingml/2006/main" xmlns:pic="http://schemas.openxmlformats.org/drawingml/2006/picture">
+            <wp:extent cx="4680000" cy="1484850"/>
+            <wp:docPr id="475959976" name="Picture 475959976"/>
+            <wp:cNvGraphicFramePr>
+              <a:graphicFrameLocks noChangeAspect="1"/>
+            </wp:cNvGraphicFramePr>
+            <a:graphic>
+              <a:graphicData uri="http://schemas.openxmlformats.org/drawingml/2006/picture">
+                <pic:pic>
+                  <pic:nvPicPr>
+                    <pic:cNvPr id="0" name="ch17_tavole_booleane.png"/>
+                    <pic:cNvPicPr/>
+                  </pic:nvPicPr>
+                  <pic:blipFill>
+                    <a:blip r:embed="rId25"/>
+                    <a:stretch>
+                      <a:fillRect/>
+                    </a:stretch>
+                  </pic:blipFill>
+                  <pic:spPr>
+                    <a:xfrm>
+                      <a:off x="0" y="0"/>
+                      <a:ext cx="4680000" cy="1484850"/>
+                    </a:xfrm>
+                    <a:prstGeom prst="rect"/>
+                  </pic:spPr>
+                </pic:pic>
+              </a:graphicData>
+            </a:graphic>
+          </wp:inline>
+        </w:drawing>
+      </w:r>
+    </w:p>
+    <w:p>
+      <w:pPr>
+        <w:jc w:val="center"/>
+      </w:pPr>
+      <w:r>
+        <w:rPr>
+          <w:i/>
+          <w:sz w:val="18"/>
+        </w:rPr>
+        <w:t>Le tavole di verità di AND, OR e NOT.</w:t>
+      </w:r>
+    </w:p>
+    <w:p>
+      <w:r>
+        <w:rPr/>
+        <w:t>Nel prossimo capitolo si vede come usare questi operatori per confrontare un valore con un intervallo, come il C valuta le condizioni e come semplificare le espressioni complesse.</w:t>
+      </w:r>
+    </w:p>
+    <w:p>
+      <w:pPr>
+        <w:pStyle w:val="Titolo1"/>
+      </w:pPr>
+      <w:r>
+        <w:rPr>
+          <w:b/>
+          <w:color w:val="EE0000"/>
+        </w:rPr>
+        <w:t>Capitolo 18: Intervalli, Cortocircuitazione e Semplificazione delle Condizioni</w:t>
+      </w:r>
+    </w:p>
+    <w:p>
+      <w:pPr>
+        <w:pStyle w:val="Titolo2"/>
+      </w:pPr>
+      <w:r>
+        <w:rPr>
+          <w:b/>
+          <w:color w:val="E97132"/>
+        </w:rPr>
+        <w:t>Confronti su intervalli</w:t>
+      </w:r>
+    </w:p>
+    <w:p>
+      <w:r>
+        <w:rPr/>
+        <w:t xml:space="preserve">Nei programmi spesso si deve verificare se un valore cade in un certo intervallo: un indice, una temperatura, un'età. In matematica la condizione si scrive in modo compatto, </w:t>
+      </w:r>
+      <w:r>
+        <w:rPr>
+          <w:rFonts w:ascii="Consolas" w:hAnsi="Consolas" w:cs="Consolas"/>
+        </w:rPr>
+        <w:t>min ≤ x ≤ max</w:t>
+      </w:r>
+      <w:r>
+        <w:rPr/>
+        <w:t xml:space="preserve">. In C bisogna invece </w:t>
+      </w:r>
+      <w:r>
+        <w:rPr>
+          <w:b/>
+        </w:rPr>
+        <w:t>spezzare il confronto in due condizioni</w:t>
+      </w:r>
+      <w:r>
+        <w:rPr/>
+        <w:t xml:space="preserve"> e combinarle con un AND: </w:t>
+      </w:r>
+      <w:r>
+        <w:rPr>
+          <w:rFonts w:ascii="Consolas" w:hAnsi="Consolas" w:cs="Consolas"/>
+        </w:rPr>
+        <w:t>min &lt;= x &amp;&amp; x &lt;= max</w:t>
+      </w:r>
+      <w:r>
+        <w:rPr/>
+        <w:t>, che è la forma più vicina alla notazione matematica.</w:t>
+      </w:r>
+    </w:p>
+    <w:p>
+      <w:r>
+        <w:rPr/>
+        <w:t xml:space="preserve">Scrivere in C </w:t>
+      </w:r>
+      <w:r>
+        <w:rPr>
+          <w:rFonts w:ascii="Consolas" w:hAnsi="Consolas" w:cs="Consolas"/>
+        </w:rPr>
+        <w:t>min &lt;= x &lt;= max</w:t>
+      </w:r>
+      <w:r>
+        <w:rPr/>
+        <w:t xml:space="preserve"> non produce l'effetto sperato, e il pericolo è proprio che compila senza errori. Il confronto si valuta da sinistra a destra: prima </w:t>
+      </w:r>
+      <w:r>
+        <w:rPr>
+          <w:rFonts w:ascii="Consolas" w:hAnsi="Consolas" w:cs="Consolas"/>
+        </w:rPr>
+        <w:t>min &lt;= x</w:t>
+      </w:r>
+      <w:r>
+        <w:rPr/>
+        <w:t xml:space="preserve">, che dà 0 oppure 1, e poi quel risultato viene confrontato con max. Con min = 0, x = 20 e max = 10, per esempio, </w:t>
+      </w:r>
+      <w:r>
+        <w:rPr>
+          <w:rFonts w:ascii="Consolas" w:hAnsi="Consolas" w:cs="Consolas"/>
+        </w:rPr>
+        <w:t>0 &lt;= 20</w:t>
+      </w:r>
+      <w:r>
+        <w:rPr/>
+        <w:t xml:space="preserve"> vale 1 e </w:t>
+      </w:r>
+      <w:r>
+        <w:rPr>
+          <w:rFonts w:ascii="Consolas" w:hAnsi="Consolas" w:cs="Consolas"/>
+        </w:rPr>
+        <w:t>1 &lt;= 10</w:t>
+      </w:r>
+      <w:r>
+        <w:rPr/>
+        <w:t xml:space="preserve"> è vero, anche se 20 non sta nell'intervallo.</w:t>
+      </w:r>
+    </w:p>
+    <w:p>
+      <w:r>
+        <w:rPr/>
+        <w:t>I quattro tipi di intervallo si traducono così:</w:t>
+      </w:r>
+    </w:p>
+    <w:p>
+      <w:pPr>
+        <w:numPr>
+          <w:ilvl w:val="0"/>
+          <w:numId w:val="1"/>
+        </w:numPr>
+      </w:pPr>
+      <w:r>
+        <w:rPr>
+          <w:b/>
+        </w:rPr>
+        <w:t>chiuso</w:t>
+      </w:r>
+      <w:r>
+        <w:rPr/>
+        <w:t xml:space="preserve"> (inclusivo), x ∈ [min, max]: </w:t>
+      </w:r>
+      <w:r>
+        <w:rPr>
+          <w:rFonts w:ascii="Consolas" w:hAnsi="Consolas" w:cs="Consolas"/>
+        </w:rPr>
+        <w:t>min &lt;= x &amp;&amp; x &lt;= max</w:t>
+      </w:r>
+      <w:r>
+        <w:rPr/>
+        <w:t>;</w:t>
+      </w:r>
+    </w:p>
+    <w:p>
+      <w:pPr>
+        <w:numPr>
+          <w:ilvl w:val="0"/>
+          <w:numId w:val="1"/>
+        </w:numPr>
+      </w:pPr>
+      <w:r>
+        <w:rPr>
+          <w:b/>
+        </w:rPr>
+        <w:t>semiaperto sinistro</w:t>
+      </w:r>
+      <w:r>
+        <w:rPr/>
+        <w:t xml:space="preserve">, x ∈ [min, max): </w:t>
+      </w:r>
+      <w:r>
+        <w:rPr>
+          <w:rFonts w:ascii="Consolas" w:hAnsi="Consolas" w:cs="Consolas"/>
+        </w:rPr>
+        <w:t>min &lt;= x &amp;&amp; x &lt; max</w:t>
+      </w:r>
+      <w:r>
+        <w:rPr/>
+        <w:t>;</w:t>
+      </w:r>
+    </w:p>
+    <w:p>
+      <w:pPr>
+        <w:numPr>
+          <w:ilvl w:val="0"/>
+          <w:numId w:val="1"/>
+        </w:numPr>
+      </w:pPr>
+      <w:r>
+        <w:rPr>
+          <w:b/>
+        </w:rPr>
+        <w:t>semiaperto destro</w:t>
+      </w:r>
+      <w:r>
+        <w:rPr/>
+        <w:t xml:space="preserve">, x ∈ (min, max]: </w:t>
+      </w:r>
+      <w:r>
+        <w:rPr>
+          <w:rFonts w:ascii="Consolas" w:hAnsi="Consolas" w:cs="Consolas"/>
+        </w:rPr>
+        <w:t>min &lt; x &amp;&amp; x &lt;= max</w:t>
+      </w:r>
+      <w:r>
+        <w:rPr/>
+        <w:t>;</w:t>
+      </w:r>
+    </w:p>
+    <w:p>
+      <w:pPr>
+        <w:numPr>
+          <w:ilvl w:val="0"/>
+          <w:numId w:val="1"/>
+        </w:numPr>
+      </w:pPr>
+      <w:r>
+        <w:rPr>
+          <w:b/>
+        </w:rPr>
+        <w:t>aperto</w:t>
+      </w:r>
+      <w:r>
+        <w:rPr/>
+        <w:t xml:space="preserve"> (esclusivo), x ∈ (min, max): </w:t>
+      </w:r>
+      <w:r>
+        <w:rPr>
+          <w:rFonts w:ascii="Consolas" w:hAnsi="Consolas" w:cs="Consolas"/>
+        </w:rPr>
+        <w:t>min &lt; x &amp;&amp; x &lt; max</w:t>
+      </w:r>
+      <w:r>
+        <w:rPr/>
+        <w:t>.</w:t>
+      </w:r>
+    </w:p>
+    <w:p>
+      <w:pPr>
+        <w:keepNext/>
+        <w:jc w:val="center"/>
+      </w:pPr>
+      <w:r>
+        <w:drawing>
+          <wp:inline xmlns:a="http://schemas.openxmlformats.org/drawingml/2006/main" xmlns:pic="http://schemas.openxmlformats.org/drawingml/2006/picture">
+            <wp:extent cx="4680000" cy="1743040"/>
+            <wp:docPr id="475959977" name="Picture 475959977"/>
+            <wp:cNvGraphicFramePr>
+              <a:graphicFrameLocks noChangeAspect="1"/>
+            </wp:cNvGraphicFramePr>
+            <a:graphic>
+              <a:graphicData uri="http://schemas.openxmlformats.org/drawingml/2006/picture">
+                <pic:pic>
+                  <pic:nvPicPr>
+                    <pic:cNvPr id="0" name="ch18_intervalli.png"/>
+                    <pic:cNvPicPr/>
+                  </pic:nvPicPr>
+                  <pic:blipFill>
+                    <a:blip r:embed="rId26"/>
+                    <a:stretch>
+                      <a:fillRect/>
+                    </a:stretch>
+                  </pic:blipFill>
+                  <pic:spPr>
+                    <a:xfrm>
+                      <a:off x="0" y="0"/>
+                      <a:ext cx="4680000" cy="1743040"/>
+                    </a:xfrm>
+                    <a:prstGeom prst="rect"/>
+                  </pic:spPr>
+                </pic:pic>
+              </a:graphicData>
+            </a:graphic>
+          </wp:inline>
+        </w:drawing>
+      </w:r>
+    </w:p>
+    <w:p>
+      <w:pPr>
+        <w:jc w:val="center"/>
+      </w:pPr>
+      <w:r>
+        <w:rPr>
+          <w:i/>
+          <w:sz w:val="18"/>
+        </w:rPr>
+        <w:t>I quattro tipi di intervallo e la loro espressione in C: il cerchio pieno include l'estremo, quello vuoto lo esclude.</w:t>
+      </w:r>
+    </w:p>
+    <w:p>
+      <w:r>
+        <w:rPr/>
+        <w:t>Le denominazioni "sinistro" e "destro" sono quelle usate nel corso: contano le notazioni tra parentesi. Nel corso si userà molto questa notazione per verificare se un indice appartiene a un intervallo semiaperto sinistro.</w:t>
+      </w:r>
+    </w:p>
+    <w:p>
+      <w:pPr>
+        <w:pStyle w:val="Titolo2"/>
+      </w:pPr>
+      <w:r>
+        <w:rPr>
+          <w:b/>
+          <w:color w:val="E97132"/>
+        </w:rPr>
+        <w:t>La cortocircuitazione</w:t>
+      </w:r>
+    </w:p>
+    <w:p>
+      <w:r>
+        <w:rPr/>
+        <w:t xml:space="preserve">Quando si combinano più condizioni con AND oppure OR, il C interrompe la valutazione appena il risultato è già determinato (lo standard lo garantisce). Questo comportamento si chiama </w:t>
+      </w:r>
+      <w:r>
+        <w:rPr>
+          <w:b/>
+        </w:rPr>
+        <w:t>cortocircuitazione</w:t>
+      </w:r>
+      <w:r>
+        <w:rPr/>
+        <w:t xml:space="preserve"> (in inglese *short-circuit evaluation*):</w:t>
+      </w:r>
+    </w:p>
+    <w:p>
+      <w:pPr>
+        <w:numPr>
+          <w:ilvl w:val="0"/>
+          <w:numId w:val="1"/>
+        </w:numPr>
+      </w:pPr>
+      <w:r>
+        <w:rPr/>
+        <w:t>con l'</w:t>
+      </w:r>
+      <w:r>
+        <w:rPr>
+          <w:b/>
+        </w:rPr>
+        <w:t>AND</w:t>
+      </w:r>
+      <w:r>
+        <w:rPr/>
+        <w:t>, se la prima condizione è falsa il risultato è sicuramente falso, e la seconda non viene valutata;</w:t>
+      </w:r>
+    </w:p>
+    <w:p>
+      <w:pPr>
+        <w:numPr>
+          <w:ilvl w:val="0"/>
+          <w:numId w:val="1"/>
+        </w:numPr>
+      </w:pPr>
+      <w:r>
+        <w:rPr/>
+        <w:t>con l'</w:t>
+      </w:r>
+      <w:r>
+        <w:rPr>
+          <w:b/>
+        </w:rPr>
+        <w:t>OR</w:t>
+      </w:r>
+      <w:r>
+        <w:rPr/>
+        <w:t>, se la prima condizione è vera il risultato è sicuramente vero, e la seconda non viene valutata.</w:t>
+      </w:r>
+    </w:p>
+    <w:p>
+      <w:r>
+        <w:rPr/>
+        <w:t>La cortocircuitazione non è solo un risparmio di tempo, ma permette di scrivere condizioni che altrimenti sarebbero pericolose. Per verificare che il divisore sia diverso da zero e che la divisione dia un risultato maggiore di 5 si scrive:</w:t>
+      </w:r>
+    </w:p>
+    <w:p>
+      <w:pPr>
+        <w:spacing w:after="0" w:before="0" w:line="240" w:lineRule="auto"/>
+      </w:pPr>
+      <w:r>
+        <w:rPr>
+          <w:rFonts w:ascii="Consolas" w:hAnsi="Consolas" w:cs="Consolas"/>
+          <w:sz w:val="17"/>
+        </w:rPr>
+        <w:t>bool condizione = (divisore != 0) &amp;&amp; ((numeratore / divisore) &gt; 5);</w:t>
+      </w:r>
+    </w:p>
+    <w:p/>
+    <w:p>
+      <w:r>
+        <w:rPr/>
+        <w:t>Se il divisore è 0 la seconda parte non viene eseguita, e si evita l'errore a tempo di esecuzione della divisione per zero. Un altro esempio verifica che l'utente abbia inserito un numero e che sia pari:</w:t>
+      </w:r>
+    </w:p>
+    <w:p>
+      <w:pPr>
+        <w:spacing w:after="0" w:before="0" w:line="240" w:lineRule="auto"/>
+      </w:pPr>
+      <w:r>
+        <w:rPr>
+          <w:rFonts w:ascii="Consolas" w:hAnsi="Consolas" w:cs="Consolas"/>
+          <w:sz w:val="17"/>
+        </w:rPr>
+        <w:t>int valore;</w:t>
+      </w:r>
+    </w:p>
+    <w:p>
+      <w:pPr>
+        <w:spacing w:after="0" w:before="0" w:line="240" w:lineRule="auto"/>
+      </w:pPr>
+      <w:r>
+        <w:rPr>
+          <w:rFonts w:ascii="Consolas" w:hAnsi="Consolas" w:cs="Consolas"/>
+          <w:sz w:val="17"/>
+        </w:rPr>
+        <w:t>bool scanPari = (scanf("%d", &amp;valore) == 1) &amp;&amp; (valore % 2 == 0);</w:t>
+      </w:r>
+    </w:p>
+    <w:p/>
+    <w:p>
+      <w:r>
+        <w:rPr/>
+        <w:t>Se scanf non riesce a leggere il valore (il suo risultato, come visto nel capitolo 10, non è 1), la parte a destra non viene valutata e non si guarda il contenuto di valore, che in quel caso non è affidabile.</w:t>
+      </w:r>
+    </w:p>
+    <w:p>
+      <w:r>
+        <w:rPr/>
+        <w:t>Lo stesso schema si ritrova in un programma completo, che legge un numero e stampa tre risultati:</w:t>
+      </w:r>
+    </w:p>
+    <w:p>
+      <w:pPr>
+        <w:spacing w:after="0" w:before="0" w:line="240" w:lineRule="auto"/>
+      </w:pPr>
+      <w:r>
+        <w:rPr>
+          <w:rFonts w:ascii="Consolas" w:hAnsi="Consolas" w:cs="Consolas"/>
+          <w:sz w:val="17"/>
+        </w:rPr>
+        <w:t>#include &lt;stdio.h&gt;</w:t>
+      </w:r>
+    </w:p>
+    <w:p>
+      <w:pPr>
+        <w:spacing w:after="0" w:before="0" w:line="240" w:lineRule="auto"/>
+      </w:pPr>
+      <w:r>
+        <w:rPr>
+          <w:rFonts w:ascii="Consolas" w:hAnsi="Consolas" w:cs="Consolas"/>
+          <w:sz w:val="17"/>
+        </w:rPr>
+        <w:t>#include &lt;stdbool.h&gt;</w:t>
+      </w:r>
+    </w:p>
+    <w:p>
+      <w:pPr>
+        <w:spacing w:after="0" w:before="0" w:line="240" w:lineRule="auto"/>
+      </w:pPr>
+      <w:r>
+        <w:rPr>
+          <w:rFonts w:ascii="Consolas" w:hAnsi="Consolas" w:cs="Consolas"/>
+          <w:sz w:val="17"/>
+        </w:rPr>
+        <w:t>int main(void) {</w:t>
+      </w:r>
+    </w:p>
+    <w:p>
+      <w:pPr>
+        <w:spacing w:after="0" w:before="0" w:line="240" w:lineRule="auto"/>
+      </w:pPr>
+      <w:r>
+        <w:rPr>
+          <w:rFonts w:ascii="Consolas" w:hAnsi="Consolas" w:cs="Consolas"/>
+          <w:sz w:val="17"/>
+        </w:rPr>
+        <w:t xml:space="preserve">    int numero;</w:t>
+      </w:r>
+    </w:p>
+    <w:p>
+      <w:pPr>
+        <w:spacing w:after="0" w:before="0" w:line="240" w:lineRule="auto"/>
+      </w:pPr>
+      <w:r>
+        <w:rPr>
+          <w:rFonts w:ascii="Consolas" w:hAnsi="Consolas" w:cs="Consolas"/>
+          <w:sz w:val="17"/>
+        </w:rPr>
+        <w:t xml:space="preserve">    bool letto, positivo, dispari;</w:t>
+      </w:r>
+    </w:p>
+    <w:p>
+      <w:pPr>
+        <w:spacing w:after="0" w:before="0" w:line="240" w:lineRule="auto"/>
+      </w:pPr>
+      <w:r>
+        <w:rPr>
+          <w:rFonts w:ascii="Consolas" w:hAnsi="Consolas" w:cs="Consolas"/>
+          <w:sz w:val="17"/>
+        </w:rPr>
+        <w:t xml:space="preserve">    printf("Inserisci un numero intero: ");</w:t>
+      </w:r>
+    </w:p>
+    <w:p>
+      <w:pPr>
+        <w:spacing w:after="0" w:before="0" w:line="240" w:lineRule="auto"/>
+      </w:pPr>
+      <w:r>
+        <w:rPr>
+          <w:rFonts w:ascii="Consolas" w:hAnsi="Consolas" w:cs="Consolas"/>
+          <w:sz w:val="17"/>
+        </w:rPr>
+        <w:t xml:space="preserve">    letto = (scanf("%d", &amp;numero) == 1);     // true se scanf ha letto correttamente</w:t>
+      </w:r>
+    </w:p>
+    <w:p>
+      <w:pPr>
+        <w:spacing w:after="0" w:before="0" w:line="240" w:lineRule="auto"/>
+      </w:pPr>
+      <w:r>
+        <w:rPr>
+          <w:rFonts w:ascii="Consolas" w:hAnsi="Consolas" w:cs="Consolas"/>
+          <w:sz w:val="17"/>
+        </w:rPr>
+        <w:t xml:space="preserve">    positivo = letto &amp;&amp; (numero &gt; 0);         // input valido e maggiore di 0</w:t>
+      </w:r>
+    </w:p>
+    <w:p>
+      <w:pPr>
+        <w:spacing w:after="0" w:before="0" w:line="240" w:lineRule="auto"/>
+      </w:pPr>
+      <w:r>
+        <w:rPr>
+          <w:rFonts w:ascii="Consolas" w:hAnsi="Consolas" w:cs="Consolas"/>
+          <w:sz w:val="17"/>
+        </w:rPr>
+        <w:t xml:space="preserve">    dispari  = letto &amp;&amp; (numero % 2 != 0);    // input valido e non divisibile per 2</w:t>
+      </w:r>
+    </w:p>
+    <w:p>
+      <w:pPr>
+        <w:spacing w:after="0" w:before="0" w:line="240" w:lineRule="auto"/>
+      </w:pPr>
+      <w:r>
+        <w:rPr>
+          <w:rFonts w:ascii="Consolas" w:hAnsi="Consolas" w:cs="Consolas"/>
+          <w:sz w:val="17"/>
+        </w:rPr>
+        <w:t xml:space="preserve">    // stampa i risultati (0 = falso, 1 = vero)</w:t>
+      </w:r>
+    </w:p>
+    <w:p>
+      <w:pPr>
+        <w:spacing w:after="0" w:before="0" w:line="240" w:lineRule="auto"/>
+      </w:pPr>
+      <w:r>
+        <w:rPr>
+          <w:rFonts w:ascii="Consolas" w:hAnsi="Consolas" w:cs="Consolas"/>
+          <w:sz w:val="17"/>
+        </w:rPr>
+        <w:t xml:space="preserve">    printf("Input valido? %d\n", letto);</w:t>
+      </w:r>
+    </w:p>
+    <w:p>
+      <w:pPr>
+        <w:spacing w:after="0" w:before="0" w:line="240" w:lineRule="auto"/>
+      </w:pPr>
+      <w:r>
+        <w:rPr>
+          <w:rFonts w:ascii="Consolas" w:hAnsi="Consolas" w:cs="Consolas"/>
+          <w:sz w:val="17"/>
+        </w:rPr>
+        <w:t xml:space="preserve">    printf("Numero positivo? %d\n", positivo);</w:t>
+      </w:r>
+    </w:p>
+    <w:p>
+      <w:pPr>
+        <w:spacing w:after="0" w:before="0" w:line="240" w:lineRule="auto"/>
+      </w:pPr>
+      <w:r>
+        <w:rPr>
+          <w:rFonts w:ascii="Consolas" w:hAnsi="Consolas" w:cs="Consolas"/>
+          <w:sz w:val="17"/>
+        </w:rPr>
+        <w:t xml:space="preserve">    printf("Numero dispari? %d\n", dispari);</w:t>
+      </w:r>
+    </w:p>
+    <w:p>
+      <w:pPr>
+        <w:spacing w:after="0" w:before="0" w:line="240" w:lineRule="auto"/>
+      </w:pPr>
+      <w:r>
+        <w:rPr>
+          <w:rFonts w:ascii="Consolas" w:hAnsi="Consolas" w:cs="Consolas"/>
+          <w:sz w:val="17"/>
+        </w:rPr>
+        <w:t>}</w:t>
+      </w:r>
+    </w:p>
+    <w:p/>
+    <w:p>
+      <w:r>
+        <w:rPr/>
+        <w:t xml:space="preserve">Se l'utente inserisce 7 il programma stampa 1 per tutte e tre le domande; se inserisce una lettera, </w:t>
+      </w:r>
+      <w:r>
+        <w:rPr>
+          <w:rFonts w:ascii="Consolas" w:hAnsi="Consolas" w:cs="Consolas"/>
+        </w:rPr>
+        <w:t>letto</w:t>
+      </w:r>
+      <w:r>
+        <w:rPr/>
+        <w:t xml:space="preserve"> vale 0 e di conseguenza anche le altre due condizioni valgono 0.</w:t>
+      </w:r>
+    </w:p>
+    <w:p>
+      <w:pPr>
+        <w:pStyle w:val="Titolo2"/>
+      </w:pPr>
+      <w:r>
+        <w:rPr>
+          <w:b/>
+          <w:color w:val="E97132"/>
+        </w:rPr>
+        <w:t>Semplificare le espressioni complesse</w:t>
+      </w:r>
+    </w:p>
+    <w:p>
+      <w:r>
+        <w:rPr/>
+        <w:t>Le espressioni booleane con molti AND e OR mescolati diventano difficili da leggere, facili da scrivere in modo sbagliato e complicate da modificare. Ecco un esempio:</w:t>
+      </w:r>
+    </w:p>
+    <w:p>
+      <w:pPr>
+        <w:spacing w:after="0" w:before="0" w:line="240" w:lineRule="auto"/>
+      </w:pPr>
+      <w:r>
+        <w:rPr>
+          <w:rFonts w:ascii="Consolas" w:hAnsi="Consolas" w:cs="Consolas"/>
+          <w:sz w:val="17"/>
+        </w:rPr>
+        <w:t>bool sconto = registrato &amp;&amp; spesaTotale &gt;= 100 ||</w:t>
+      </w:r>
+    </w:p>
+    <w:p>
+      <w:pPr>
+        <w:spacing w:after="0" w:before="0" w:line="240" w:lineRule="auto"/>
+      </w:pPr>
+      <w:r>
+        <w:rPr>
+          <w:rFonts w:ascii="Consolas" w:hAnsi="Consolas" w:cs="Consolas"/>
+          <w:sz w:val="17"/>
+        </w:rPr>
+        <w:t xml:space="preserve">              (codiceNonScaduto &amp;&amp; attivatoDallUtente);</w:t>
+      </w:r>
+    </w:p>
+    <w:p/>
+    <w:p>
+      <w:r>
+        <w:rPr/>
+        <w:t>Si procede spezzando l'espressione in sotto-condizioni con nomi chiari, usando variabili booleane intermedie e rendendo la condizione finale la combinazione semplice di pochi termini:</w:t>
+      </w:r>
+    </w:p>
+    <w:p>
+      <w:pPr>
+        <w:spacing w:after="0" w:before="0" w:line="240" w:lineRule="auto"/>
+      </w:pPr>
+      <w:r>
+        <w:rPr>
+          <w:rFonts w:ascii="Consolas" w:hAnsi="Consolas" w:cs="Consolas"/>
+          <w:sz w:val="17"/>
+        </w:rPr>
+        <w:t>bool clientePremium = registrato &amp;&amp; (spesaTotale &gt;= 100);</w:t>
+      </w:r>
+    </w:p>
+    <w:p>
+      <w:pPr>
+        <w:spacing w:after="0" w:before="0" w:line="240" w:lineRule="auto"/>
+      </w:pPr>
+      <w:r>
+        <w:rPr>
+          <w:rFonts w:ascii="Consolas" w:hAnsi="Consolas" w:cs="Consolas"/>
+          <w:sz w:val="17"/>
+        </w:rPr>
+        <w:t>bool promoExtra     = codiceNonScaduto &amp;&amp; attivatoDallUtente;</w:t>
+      </w:r>
+    </w:p>
+    <w:p>
+      <w:pPr>
+        <w:spacing w:after="0" w:before="0" w:line="240" w:lineRule="auto"/>
+      </w:pPr>
+      <w:r>
+        <w:rPr>
+          <w:rFonts w:ascii="Consolas" w:hAnsi="Consolas" w:cs="Consolas"/>
+          <w:sz w:val="17"/>
+        </w:rPr>
+        <w:t>bool sconto         = clientePremium || promoExtra;</w:t>
+      </w:r>
+    </w:p>
+    <w:p/>
+    <w:p>
+      <w:r>
+        <w:rPr/>
+        <w:t>Le due versioni calcolano la stessa cosa, perché in C l'AND ha la precedenza sull'OR; ma la seconda si legge a colpo d'occhio e ogni condizione ha un nome che spiega a che cosa serve.</w:t>
+      </w:r>
+    </w:p>
+    <w:p>
+      <w:pPr>
+        <w:pStyle w:val="Titolo2"/>
+      </w:pPr>
+      <w:r>
+        <w:rPr>
+          <w:b/>
+          <w:color w:val="E97132"/>
+        </w:rPr>
+        <w:t>L'operatore condizionale ternario</w:t>
+      </w:r>
+    </w:p>
+    <w:p>
+      <w:r>
+        <w:rPr/>
+        <w:t>L'</w:t>
+      </w:r>
+      <w:r>
+        <w:rPr>
+          <w:b/>
+        </w:rPr>
+        <w:t>operatore ternario</w:t>
+      </w:r>
+      <w:r>
+        <w:rPr/>
+        <w:t xml:space="preserve"> è un operatore condizionale compatto, che ha la forma </w:t>
+      </w:r>
+      <w:r>
+        <w:rPr>
+          <w:rFonts w:ascii="Consolas" w:hAnsi="Consolas" w:cs="Consolas"/>
+        </w:rPr>
+        <w:t>condizione ? valore_se_vero : valore_se_falso</w:t>
+      </w:r>
+      <w:r>
+        <w:rPr/>
+        <w:t>. Si valuta la condizione: se è vera l'espressione vale il primo valore, se è falsa vale il secondo. È utile per piccole espressioni condizionali, ma solo se non pregiudica la semplicità del codice:</w:t>
+      </w:r>
+    </w:p>
+    <w:p>
+      <w:pPr>
+        <w:spacing w:after="0" w:before="0" w:line="240" w:lineRule="auto"/>
+      </w:pPr>
+      <w:r>
+        <w:rPr>
+          <w:rFonts w:ascii="Consolas" w:hAnsi="Consolas" w:cs="Consolas"/>
+          <w:sz w:val="17"/>
+        </w:rPr>
+        <w:t>int x = 5;</w:t>
+      </w:r>
+    </w:p>
+    <w:p>
+      <w:pPr>
+        <w:spacing w:after="0" w:before="0" w:line="240" w:lineRule="auto"/>
+      </w:pPr>
+      <w:r>
+        <w:rPr>
+          <w:rFonts w:ascii="Consolas" w:hAnsi="Consolas" w:cs="Consolas"/>
+          <w:sz w:val="17"/>
+        </w:rPr>
+        <w:t>int y = (x % 2 == 0) ? 100 : 200;   // y = 200, perché x è dispari</w:t>
+      </w:r>
+    </w:p>
+    <w:p/>
+    <w:p>
+      <w:r>
+        <w:rPr/>
+        <w:t xml:space="preserve">Per condizioni più articolate è meglio usare i blocchi </w:t>
+      </w:r>
+      <w:r>
+        <w:rPr>
+          <w:rFonts w:ascii="Consolas" w:hAnsi="Consolas" w:cs="Consolas"/>
+        </w:rPr>
+        <w:t>if..else</w:t>
+      </w:r>
+      <w:r>
+        <w:rPr/>
+        <w:t>, che sono l'argomento del prossimo capitolo.</w:t>
+      </w:r>
+    </w:p>
+    <w:p>
+      <w:pPr>
+        <w:pStyle w:val="Titolo1"/>
+      </w:pPr>
+      <w:r>
+        <w:rPr>
+          <w:b/>
+          <w:color w:val="EE0000"/>
+        </w:rPr>
+        <w:t>Capitolo 19: Il Controllo di Flusso e il Costrutto if</w:t>
+      </w:r>
+    </w:p>
+    <w:p>
+      <w:pPr>
+        <w:pStyle w:val="Titolo2"/>
+      </w:pPr>
+      <w:r>
+        <w:rPr>
+          <w:b/>
+          <w:color w:val="E97132"/>
+        </w:rPr>
+        <w:t>Dalla sequenza alle decisioni</w:t>
+      </w:r>
+    </w:p>
+    <w:p>
+      <w:r>
+        <w:rPr/>
+        <w:t xml:space="preserve">Finora abbiamo scritto programmi in cui le istruzioni vengono eseguite prevalentemente una dopo l'altra. Per costruire algoritmi più articolati dobbiamo invece poter </w:t>
+      </w:r>
+      <w:r>
+        <w:rPr>
+          <w:b/>
+        </w:rPr>
+        <w:t>controllare l'ordine</w:t>
+      </w:r>
+      <w:r>
+        <w:rPr/>
+        <w:t xml:space="preserve"> con cui le istruzioni vengono eseguite. La programmazione strutturata (capitolo 3) utilizza tre strutture di controllo fondamentali:</w:t>
+      </w:r>
+    </w:p>
+    <w:p>
+      <w:pPr>
+        <w:numPr>
+          <w:ilvl w:val="0"/>
+          <w:numId w:val="1"/>
+        </w:numPr>
+      </w:pPr>
+      <w:r>
+        <w:rPr/>
+        <w:t xml:space="preserve">la </w:t>
+      </w:r>
+      <w:r>
+        <w:rPr>
+          <w:b/>
+        </w:rPr>
+        <w:t>sequenza</w:t>
+      </w:r>
+      <w:r>
+        <w:rPr/>
+        <w:t>: esecuzione ordinata delle istruzioni;</w:t>
+      </w:r>
+    </w:p>
+    <w:p>
+      <w:pPr>
+        <w:numPr>
+          <w:ilvl w:val="0"/>
+          <w:numId w:val="1"/>
+        </w:numPr>
+      </w:pPr>
+      <w:r>
+        <w:rPr/>
+        <w:t xml:space="preserve">la </w:t>
+      </w:r>
+      <w:r>
+        <w:rPr>
+          <w:b/>
+        </w:rPr>
+        <w:t>selezione</w:t>
+      </w:r>
+      <w:r>
+        <w:rPr/>
+        <w:t>: scelta fra alternative, che si realizza con l'</w:t>
+      </w:r>
+      <w:r>
+        <w:rPr>
+          <w:rFonts w:ascii="Consolas" w:hAnsi="Consolas" w:cs="Consolas"/>
+        </w:rPr>
+        <w:t>if</w:t>
+      </w:r>
+      <w:r>
+        <w:rPr/>
+        <w:t>;</w:t>
+      </w:r>
+    </w:p>
+    <w:p>
+      <w:pPr>
+        <w:numPr>
+          <w:ilvl w:val="0"/>
+          <w:numId w:val="1"/>
+        </w:numPr>
+      </w:pPr>
+      <w:r>
+        <w:rPr/>
+        <w:t>l'</w:t>
+      </w:r>
+      <w:r>
+        <w:rPr>
+          <w:b/>
+        </w:rPr>
+        <w:t>iterazione</w:t>
+      </w:r>
+      <w:r>
+        <w:rPr/>
+        <w:t xml:space="preserve">: ripetizione condizionata, con </w:t>
+      </w:r>
+      <w:r>
+        <w:rPr>
+          <w:rFonts w:ascii="Consolas" w:hAnsi="Consolas" w:cs="Consolas"/>
+        </w:rPr>
+        <w:t>while</w:t>
+      </w:r>
+      <w:r>
+        <w:rPr/>
+        <w:t xml:space="preserve">, </w:t>
+      </w:r>
+      <w:r>
+        <w:rPr>
+          <w:rFonts w:ascii="Consolas" w:hAnsi="Consolas" w:cs="Consolas"/>
+        </w:rPr>
+        <w:t>for</w:t>
+      </w:r>
+      <w:r>
+        <w:rPr/>
+        <w:t xml:space="preserve"> e </w:t>
+      </w:r>
+      <w:r>
+        <w:rPr>
+          <w:rFonts w:ascii="Consolas" w:hAnsi="Consolas" w:cs="Consolas"/>
+        </w:rPr>
+        <w:t>do-while</w:t>
+      </w:r>
+      <w:r>
+        <w:rPr/>
+        <w:t>.</w:t>
+      </w:r>
+    </w:p>
+    <w:p>
+      <w:r>
+        <w:rPr/>
+        <w:t>In questo capitolo ci occupiamo della selezione, mentre l'iterazione verrà dopo.</w:t>
+      </w:r>
+    </w:p>
+    <w:p>
+      <w:pPr>
+        <w:pStyle w:val="Titolo2"/>
+      </w:pPr>
+      <w:r>
+        <w:rPr>
+          <w:b/>
+          <w:color w:val="E97132"/>
+        </w:rPr>
+        <w:t>Tre strutture sono sufficienti</w:t>
+      </w:r>
+    </w:p>
+    <w:p>
+      <w:r>
+        <w:rPr/>
+        <w:t xml:space="preserve">Negli anni Sessanta non era ancora chiaro quale fosse il giusto insieme di astrazioni per esprimere il flusso di controllo di un programma. Nel 1966 Corrado Böhm e Giuseppe Jacopini mostrarono che sequenza, selezione e iterazione sono </w:t>
+      </w:r>
+      <w:r>
+        <w:rPr>
+          <w:b/>
+        </w:rPr>
+        <w:t>sufficienti per rappresentare qualsiasi funzione calcolabile</w:t>
+      </w:r>
+      <w:r>
+        <w:rPr/>
+        <w:t xml:space="preserve">: è il </w:t>
+      </w:r>
+      <w:r>
+        <w:rPr>
+          <w:b/>
+        </w:rPr>
+        <w:t>teorema di Böhm–Jacopini</w:t>
+      </w:r>
+      <w:r>
+        <w:rPr/>
+        <w:t>. Questo risultato è alla base della programmazione strutturata e ha influenzato profondamente i linguaggi moderni: poche strutture di controllo elementari, componibili e annidabili, permettono di costruire algoritmi arbitrariamente complessi.</w:t>
+      </w:r>
+    </w:p>
+    <w:p>
+      <w:pPr>
+        <w:pStyle w:val="Titolo2"/>
+      </w:pPr>
+      <w:r>
+        <w:rPr>
+          <w:b/>
+          <w:color w:val="E97132"/>
+        </w:rPr>
+        <w:t>Il controllo di flusso condizionato</w:t>
+      </w:r>
+    </w:p>
+    <w:p>
+      <w:r>
+        <w:rPr/>
+        <w:t xml:space="preserve">Vediamo come rappresentare le scelte: se una condizione è vera si esegue un blocco di codice; se è falsa si fa qualcos'altro oppure si passa oltre. Questo meccanismo si chiama </w:t>
+      </w:r>
+      <w:r>
+        <w:rPr>
+          <w:b/>
+        </w:rPr>
+        <w:t>controllo di flusso condizionato</w:t>
+      </w:r>
+      <w:r>
+        <w:rPr/>
+        <w:t xml:space="preserve">. Un esempio quotidiano: se piove prendo l'ombrello, altrimenti esco senza (qui </w:t>
+      </w:r>
+      <w:r>
+        <w:rPr>
+          <w:rFonts w:ascii="Consolas" w:hAnsi="Consolas" w:cs="Consolas"/>
+        </w:rPr>
+        <w:t>piove</w:t>
+      </w:r>
+      <w:r>
+        <w:rPr/>
+        <w:t xml:space="preserve"> è una variabile booleana).</w:t>
+      </w:r>
+    </w:p>
+    <w:p>
+      <w:pPr>
+        <w:spacing w:after="0" w:before="0" w:line="240" w:lineRule="auto"/>
+      </w:pPr>
+      <w:r>
+        <w:rPr>
+          <w:rFonts w:ascii="Consolas" w:hAnsi="Consolas" w:cs="Consolas"/>
+          <w:sz w:val="17"/>
+        </w:rPr>
+        <w:t>if (piove) {</w:t>
+      </w:r>
+    </w:p>
+    <w:p>
+      <w:pPr>
+        <w:spacing w:after="0" w:before="0" w:line="240" w:lineRule="auto"/>
+      </w:pPr>
+      <w:r>
+        <w:rPr>
+          <w:rFonts w:ascii="Consolas" w:hAnsi="Consolas" w:cs="Consolas"/>
+          <w:sz w:val="17"/>
+        </w:rPr>
+        <w:t xml:space="preserve">    printf("Prendi l'ombrello.\n");</w:t>
+      </w:r>
+    </w:p>
+    <w:p>
+      <w:pPr>
+        <w:spacing w:after="0" w:before="0" w:line="240" w:lineRule="auto"/>
+      </w:pPr>
+      <w:r>
+        <w:rPr>
+          <w:rFonts w:ascii="Consolas" w:hAnsi="Consolas" w:cs="Consolas"/>
+          <w:sz w:val="17"/>
+        </w:rPr>
+        <w:t>}</w:t>
+      </w:r>
+    </w:p>
+    <w:p>
+      <w:pPr>
+        <w:spacing w:after="0" w:before="0" w:line="240" w:lineRule="auto"/>
+      </w:pPr>
+      <w:r>
+        <w:rPr>
+          <w:rFonts w:ascii="Consolas" w:hAnsi="Consolas" w:cs="Consolas"/>
+          <w:sz w:val="17"/>
+        </w:rPr>
+        <w:t>else {</w:t>
+      </w:r>
+    </w:p>
+    <w:p>
+      <w:pPr>
+        <w:spacing w:after="0" w:before="0" w:line="240" w:lineRule="auto"/>
+      </w:pPr>
+      <w:r>
+        <w:rPr>
+          <w:rFonts w:ascii="Consolas" w:hAnsi="Consolas" w:cs="Consolas"/>
+          <w:sz w:val="17"/>
+        </w:rPr>
+        <w:t xml:space="preserve">    printf("Esci senza.\n");</w:t>
+      </w:r>
+    </w:p>
+    <w:p>
+      <w:pPr>
+        <w:spacing w:after="0" w:before="0" w:line="240" w:lineRule="auto"/>
+      </w:pPr>
+      <w:r>
+        <w:rPr>
+          <w:rFonts w:ascii="Consolas" w:hAnsi="Consolas" w:cs="Consolas"/>
+          <w:sz w:val="17"/>
+        </w:rPr>
+        <w:t>}</w:t>
+      </w:r>
+    </w:p>
+    <w:p/>
+    <w:p>
+      <w:r>
+        <w:rPr/>
+        <w:t>La condizione fra parentesi è un'espressione booleana, di quelle viste nei capitoli 17 e 18.</w:t>
+      </w:r>
+    </w:p>
+    <w:p>
+      <w:pPr>
+        <w:pStyle w:val="Titolo2"/>
+      </w:pPr>
+      <w:r>
+        <w:rPr>
+          <w:b/>
+          <w:color w:val="E97132"/>
+        </w:rPr>
+        <w:t>Il costrutto if</w:t>
+      </w:r>
+    </w:p>
+    <w:p>
+      <w:r>
+        <w:rPr/>
+        <w:t>L'</w:t>
+      </w:r>
+      <w:r>
+        <w:rPr>
+          <w:b/>
+        </w:rPr>
+        <w:t>if</w:t>
+      </w:r>
+      <w:r>
+        <w:rPr/>
+        <w:t xml:space="preserve"> è il costrutto che permette al programma di scegliere che cosa fare in base a una condizione logica. La sintassi è:</w:t>
+      </w:r>
+    </w:p>
+    <w:p>
+      <w:pPr>
+        <w:spacing w:after="0" w:before="0" w:line="240" w:lineRule="auto"/>
+      </w:pPr>
+      <w:r>
+        <w:rPr>
+          <w:rFonts w:ascii="Consolas" w:hAnsi="Consolas" w:cs="Consolas"/>
+          <w:sz w:val="17"/>
+        </w:rPr>
+        <w:t>if (condizione) {</w:t>
+      </w:r>
+    </w:p>
+    <w:p>
+      <w:pPr>
+        <w:spacing w:after="0" w:before="0" w:line="240" w:lineRule="auto"/>
+      </w:pPr>
+      <w:r>
+        <w:rPr>
+          <w:rFonts w:ascii="Consolas" w:hAnsi="Consolas" w:cs="Consolas"/>
+          <w:sz w:val="17"/>
+        </w:rPr>
+        <w:t xml:space="preserve">    // codice eseguito solo se la condizione è vera</w:t>
+      </w:r>
+    </w:p>
+    <w:p>
+      <w:pPr>
+        <w:spacing w:after="0" w:before="0" w:line="240" w:lineRule="auto"/>
+      </w:pPr>
+      <w:r>
+        <w:rPr>
+          <w:rFonts w:ascii="Consolas" w:hAnsi="Consolas" w:cs="Consolas"/>
+          <w:sz w:val="17"/>
+        </w:rPr>
+        <w:t>}</w:t>
+      </w:r>
+    </w:p>
+    <w:p/>
+    <w:p>
+      <w:r>
+        <w:rPr/>
+        <w:t>Se la condizione è vera (1) il programma entra nel blocco; se è falsa (0) lo salta e continua dopo. Per esempio:</w:t>
+      </w:r>
+    </w:p>
+    <w:p>
+      <w:pPr>
+        <w:spacing w:after="0" w:before="0" w:line="240" w:lineRule="auto"/>
+      </w:pPr>
+      <w:r>
+        <w:rPr>
+          <w:rFonts w:ascii="Consolas" w:hAnsi="Consolas" w:cs="Consolas"/>
+          <w:sz w:val="17"/>
+        </w:rPr>
+        <w:t>int voto = 25;</w:t>
+      </w:r>
+    </w:p>
+    <w:p>
+      <w:pPr>
+        <w:spacing w:after="0" w:before="0" w:line="240" w:lineRule="auto"/>
+      </w:pPr>
+      <w:r>
+        <w:rPr>
+          <w:rFonts w:ascii="Consolas" w:hAnsi="Consolas" w:cs="Consolas"/>
+          <w:sz w:val="17"/>
+        </w:rPr>
+        <w:t>if (voto &gt;= 18) {</w:t>
+      </w:r>
+    </w:p>
+    <w:p>
+      <w:pPr>
+        <w:spacing w:after="0" w:before="0" w:line="240" w:lineRule="auto"/>
+      </w:pPr>
+      <w:r>
+        <w:rPr>
+          <w:rFonts w:ascii="Consolas" w:hAnsi="Consolas" w:cs="Consolas"/>
+          <w:sz w:val="17"/>
+        </w:rPr>
+        <w:t xml:space="preserve">    printf("Esame superato!\n");</w:t>
+      </w:r>
+    </w:p>
+    <w:p>
+      <w:pPr>
+        <w:spacing w:after="0" w:before="0" w:line="240" w:lineRule="auto"/>
+      </w:pPr>
+      <w:r>
+        <w:rPr>
+          <w:rFonts w:ascii="Consolas" w:hAnsi="Consolas" w:cs="Consolas"/>
+          <w:sz w:val="17"/>
+        </w:rPr>
+        <w:t>}</w:t>
+      </w:r>
+    </w:p>
+    <w:p/>
+    <w:p>
+      <w:pPr>
+        <w:pStyle w:val="Titolo2"/>
+      </w:pPr>
+      <w:r>
+        <w:rPr>
+          <w:b/>
+          <w:color w:val="E97132"/>
+        </w:rPr>
+        <w:t>Il costrutto if-else</w:t>
+      </w:r>
+    </w:p>
+    <w:p>
+      <w:r>
+        <w:rPr/>
+        <w:t>L'</w:t>
+      </w:r>
+      <w:r>
+        <w:rPr>
+          <w:b/>
+        </w:rPr>
+        <w:t>if-else</w:t>
+      </w:r>
+      <w:r>
+        <w:rPr/>
+        <w:t xml:space="preserve"> estende l'if permettendo di gestire due percorsi alternativi:</w:t>
+      </w:r>
+    </w:p>
+    <w:p>
+      <w:pPr>
+        <w:spacing w:after="0" w:before="0" w:line="240" w:lineRule="auto"/>
+      </w:pPr>
+      <w:r>
+        <w:rPr>
+          <w:rFonts w:ascii="Consolas" w:hAnsi="Consolas" w:cs="Consolas"/>
+          <w:sz w:val="17"/>
+        </w:rPr>
+        <w:t>if (condizione) {</w:t>
+      </w:r>
+    </w:p>
+    <w:p>
+      <w:pPr>
+        <w:spacing w:after="0" w:before="0" w:line="240" w:lineRule="auto"/>
+      </w:pPr>
+      <w:r>
+        <w:rPr>
+          <w:rFonts w:ascii="Consolas" w:hAnsi="Consolas" w:cs="Consolas"/>
+          <w:sz w:val="17"/>
+        </w:rPr>
+        <w:t xml:space="preserve">    // blocco A: se la condizione è vera</w:t>
+      </w:r>
+    </w:p>
+    <w:p>
+      <w:pPr>
+        <w:spacing w:after="0" w:before="0" w:line="240" w:lineRule="auto"/>
+      </w:pPr>
+      <w:r>
+        <w:rPr>
+          <w:rFonts w:ascii="Consolas" w:hAnsi="Consolas" w:cs="Consolas"/>
+          <w:sz w:val="17"/>
+        </w:rPr>
+        <w:t>}</w:t>
+      </w:r>
+    </w:p>
+    <w:p>
+      <w:pPr>
+        <w:spacing w:after="0" w:before="0" w:line="240" w:lineRule="auto"/>
+      </w:pPr>
+      <w:r>
+        <w:rPr>
+          <w:rFonts w:ascii="Consolas" w:hAnsi="Consolas" w:cs="Consolas"/>
+          <w:sz w:val="17"/>
+        </w:rPr>
+        <w:t>else {</w:t>
+      </w:r>
+    </w:p>
+    <w:p>
+      <w:pPr>
+        <w:spacing w:after="0" w:before="0" w:line="240" w:lineRule="auto"/>
+      </w:pPr>
+      <w:r>
+        <w:rPr>
+          <w:rFonts w:ascii="Consolas" w:hAnsi="Consolas" w:cs="Consolas"/>
+          <w:sz w:val="17"/>
+        </w:rPr>
+        <w:t xml:space="preserve">    // blocco B: se la condizione è falsa</w:t>
+      </w:r>
+    </w:p>
+    <w:p>
+      <w:pPr>
+        <w:spacing w:after="0" w:before="0" w:line="240" w:lineRule="auto"/>
+      </w:pPr>
+      <w:r>
+        <w:rPr>
+          <w:rFonts w:ascii="Consolas" w:hAnsi="Consolas" w:cs="Consolas"/>
+          <w:sz w:val="17"/>
+        </w:rPr>
+        <w:t>}</w:t>
+      </w:r>
+    </w:p>
+    <w:p/>
+    <w:p>
+      <w:r>
+        <w:rPr/>
+        <w:t>Se la condizione è vera si entra nel blocco A, se è falsa nel blocco B. Un esempio:</w:t>
+      </w:r>
+    </w:p>
+    <w:p>
+      <w:pPr>
+        <w:spacing w:after="0" w:before="0" w:line="240" w:lineRule="auto"/>
+      </w:pPr>
+      <w:r>
+        <w:rPr>
+          <w:rFonts w:ascii="Consolas" w:hAnsi="Consolas" w:cs="Consolas"/>
+          <w:sz w:val="17"/>
+        </w:rPr>
+        <w:t>int batteria = 15;</w:t>
+      </w:r>
+    </w:p>
+    <w:p>
+      <w:pPr>
+        <w:spacing w:after="0" w:before="0" w:line="240" w:lineRule="auto"/>
+      </w:pPr>
+      <w:r>
+        <w:rPr>
+          <w:rFonts w:ascii="Consolas" w:hAnsi="Consolas" w:cs="Consolas"/>
+          <w:sz w:val="17"/>
+        </w:rPr>
+        <w:t>if (batteria &lt; 20) {</w:t>
+      </w:r>
+    </w:p>
+    <w:p>
+      <w:pPr>
+        <w:spacing w:after="0" w:before="0" w:line="240" w:lineRule="auto"/>
+      </w:pPr>
+      <w:r>
+        <w:rPr>
+          <w:rFonts w:ascii="Consolas" w:hAnsi="Consolas" w:cs="Consolas"/>
+          <w:sz w:val="17"/>
+        </w:rPr>
+        <w:t xml:space="preserve">    printf("Batteria quasi scarica! Collega il caricatore.\n");</w:t>
+      </w:r>
+    </w:p>
+    <w:p>
+      <w:pPr>
+        <w:spacing w:after="0" w:before="0" w:line="240" w:lineRule="auto"/>
+      </w:pPr>
+      <w:r>
+        <w:rPr>
+          <w:rFonts w:ascii="Consolas" w:hAnsi="Consolas" w:cs="Consolas"/>
+          <w:sz w:val="17"/>
+        </w:rPr>
+        <w:t>}</w:t>
+      </w:r>
+    </w:p>
+    <w:p>
+      <w:pPr>
+        <w:spacing w:after="0" w:before="0" w:line="240" w:lineRule="auto"/>
+      </w:pPr>
+      <w:r>
+        <w:rPr>
+          <w:rFonts w:ascii="Consolas" w:hAnsi="Consolas" w:cs="Consolas"/>
+          <w:sz w:val="17"/>
+        </w:rPr>
+        <w:t>else {</w:t>
+      </w:r>
+    </w:p>
+    <w:p>
+      <w:pPr>
+        <w:spacing w:after="0" w:before="0" w:line="240" w:lineRule="auto"/>
+      </w:pPr>
+      <w:r>
+        <w:rPr>
+          <w:rFonts w:ascii="Consolas" w:hAnsi="Consolas" w:cs="Consolas"/>
+          <w:sz w:val="17"/>
+        </w:rPr>
+        <w:t xml:space="preserve">    printf("Batteria sufficiente.\n");</w:t>
+      </w:r>
+    </w:p>
+    <w:p>
+      <w:pPr>
+        <w:spacing w:after="0" w:before="0" w:line="240" w:lineRule="auto"/>
+      </w:pPr>
+      <w:r>
+        <w:rPr>
+          <w:rFonts w:ascii="Consolas" w:hAnsi="Consolas" w:cs="Consolas"/>
+          <w:sz w:val="17"/>
+        </w:rPr>
+        <w:t>}</w:t>
+      </w:r>
+    </w:p>
+    <w:p/>
+    <w:p>
+      <w:r>
+        <w:rPr/>
+        <w:t xml:space="preserve">Con batteria uguale a 15 la condizione </w:t>
+      </w:r>
+      <w:r>
+        <w:rPr>
+          <w:rFonts w:ascii="Consolas" w:hAnsi="Consolas" w:cs="Consolas"/>
+        </w:rPr>
+        <w:t>batteria &lt; 20</w:t>
+      </w:r>
+      <w:r>
+        <w:rPr/>
+        <w:t xml:space="preserve"> è vera, e il programma stampa il primo messaggio.</w:t>
+      </w:r>
+    </w:p>
+    <w:p>
+      <w:pPr>
+        <w:pStyle w:val="Titolo2"/>
+      </w:pPr>
+      <w:r>
+        <w:rPr>
+          <w:b/>
+          <w:color w:val="E97132"/>
+        </w:rPr>
+        <w:t>Il costrutto if-else if-else</w:t>
+      </w:r>
+    </w:p>
+    <w:p>
+      <w:r>
+        <w:rPr/>
+        <w:t>L'</w:t>
+      </w:r>
+      <w:r>
+        <w:rPr>
+          <w:b/>
+        </w:rPr>
+        <w:t>if-else if-else</w:t>
+      </w:r>
+      <w:r>
+        <w:rPr/>
+        <w:t xml:space="preserve"> è la generalizzazione dell'if-else a più alternative:</w:t>
+      </w:r>
+    </w:p>
+    <w:p>
+      <w:pPr>
+        <w:spacing w:after="0" w:before="0" w:line="240" w:lineRule="auto"/>
+      </w:pPr>
+      <w:r>
+        <w:rPr>
+          <w:rFonts w:ascii="Consolas" w:hAnsi="Consolas" w:cs="Consolas"/>
+          <w:sz w:val="17"/>
+        </w:rPr>
+        <w:t>if (condizione1) {</w:t>
+      </w:r>
+    </w:p>
+    <w:p>
+      <w:pPr>
+        <w:spacing w:after="0" w:before="0" w:line="240" w:lineRule="auto"/>
+      </w:pPr>
+      <w:r>
+        <w:rPr>
+          <w:rFonts w:ascii="Consolas" w:hAnsi="Consolas" w:cs="Consolas"/>
+          <w:sz w:val="17"/>
+        </w:rPr>
+        <w:t xml:space="preserve">    // blocco 1</w:t>
+      </w:r>
+    </w:p>
+    <w:p>
+      <w:pPr>
+        <w:spacing w:after="0" w:before="0" w:line="240" w:lineRule="auto"/>
+      </w:pPr>
+      <w:r>
+        <w:rPr>
+          <w:rFonts w:ascii="Consolas" w:hAnsi="Consolas" w:cs="Consolas"/>
+          <w:sz w:val="17"/>
+        </w:rPr>
+        <w:t>}</w:t>
+      </w:r>
+    </w:p>
+    <w:p>
+      <w:pPr>
+        <w:spacing w:after="0" w:before="0" w:line="240" w:lineRule="auto"/>
+      </w:pPr>
+      <w:r>
+        <w:rPr>
+          <w:rFonts w:ascii="Consolas" w:hAnsi="Consolas" w:cs="Consolas"/>
+          <w:sz w:val="17"/>
+        </w:rPr>
+        <w:t>else if (condizione2) {</w:t>
+      </w:r>
+    </w:p>
+    <w:p>
+      <w:pPr>
+        <w:spacing w:after="0" w:before="0" w:line="240" w:lineRule="auto"/>
+      </w:pPr>
+      <w:r>
+        <w:rPr>
+          <w:rFonts w:ascii="Consolas" w:hAnsi="Consolas" w:cs="Consolas"/>
+          <w:sz w:val="17"/>
+        </w:rPr>
+        <w:t xml:space="preserve">    // blocco 2</w:t>
+      </w:r>
+    </w:p>
+    <w:p>
+      <w:pPr>
+        <w:spacing w:after="0" w:before="0" w:line="240" w:lineRule="auto"/>
+      </w:pPr>
+      <w:r>
+        <w:rPr>
+          <w:rFonts w:ascii="Consolas" w:hAnsi="Consolas" w:cs="Consolas"/>
+          <w:sz w:val="17"/>
+        </w:rPr>
+        <w:t>}</w:t>
+      </w:r>
+    </w:p>
+    <w:p>
+      <w:pPr>
+        <w:spacing w:after="0" w:before="0" w:line="240" w:lineRule="auto"/>
+      </w:pPr>
+      <w:r>
+        <w:rPr>
+          <w:rFonts w:ascii="Consolas" w:hAnsi="Consolas" w:cs="Consolas"/>
+          <w:sz w:val="17"/>
+        </w:rPr>
+        <w:t>else {</w:t>
+      </w:r>
+    </w:p>
+    <w:p>
+      <w:pPr>
+        <w:spacing w:after="0" w:before="0" w:line="240" w:lineRule="auto"/>
+      </w:pPr>
+      <w:r>
+        <w:rPr>
+          <w:rFonts w:ascii="Consolas" w:hAnsi="Consolas" w:cs="Consolas"/>
+          <w:sz w:val="17"/>
+        </w:rPr>
+        <w:t xml:space="preserve">    // blocco di default</w:t>
+      </w:r>
+    </w:p>
+    <w:p>
+      <w:pPr>
+        <w:spacing w:after="0" w:before="0" w:line="240" w:lineRule="auto"/>
+      </w:pPr>
+      <w:r>
+        <w:rPr>
+          <w:rFonts w:ascii="Consolas" w:hAnsi="Consolas" w:cs="Consolas"/>
+          <w:sz w:val="17"/>
+        </w:rPr>
+        <w:t>}</w:t>
+      </w:r>
+    </w:p>
+    <w:p/>
+    <w:p>
+      <w:r>
+        <w:rPr/>
+        <w:t>Se la condizione1 è vera si entra nel blocco 1; altrimenti, se è vera la condizione2, si entra nel blocco 2; e così via. Se tutte le condizioni precedenti sono false si entra nel blocco di default. Le condizioni sono valutate nell'ordine in cui sono scritte e si esegue al più un solo blocco (esattamente uno se c'è l'else finale). Per esempio, un semaforo:</w:t>
+      </w:r>
+    </w:p>
+    <w:p>
+      <w:pPr>
+        <w:spacing w:after="0" w:before="0" w:line="240" w:lineRule="auto"/>
+      </w:pPr>
+      <w:r>
+        <w:rPr>
+          <w:rFonts w:ascii="Consolas" w:hAnsi="Consolas" w:cs="Consolas"/>
+          <w:sz w:val="17"/>
+        </w:rPr>
+        <w:t>char colore = 'G';   // R = Rosso, G = Giallo, V = Verde</w:t>
+      </w:r>
+    </w:p>
+    <w:p>
+      <w:pPr>
+        <w:spacing w:after="0" w:before="0" w:line="240" w:lineRule="auto"/>
+      </w:pPr>
+      <w:r>
+        <w:rPr>
+          <w:rFonts w:ascii="Consolas" w:hAnsi="Consolas" w:cs="Consolas"/>
+          <w:sz w:val="17"/>
+        </w:rPr>
+        <w:t>if (colore == 'R') {</w:t>
+      </w:r>
+    </w:p>
+    <w:p>
+      <w:pPr>
+        <w:spacing w:after="0" w:before="0" w:line="240" w:lineRule="auto"/>
+      </w:pPr>
+      <w:r>
+        <w:rPr>
+          <w:rFonts w:ascii="Consolas" w:hAnsi="Consolas" w:cs="Consolas"/>
+          <w:sz w:val="17"/>
+        </w:rPr>
+        <w:t xml:space="preserve">    printf("Fermati!\n");</w:t>
+      </w:r>
+    </w:p>
+    <w:p>
+      <w:pPr>
+        <w:spacing w:after="0" w:before="0" w:line="240" w:lineRule="auto"/>
+      </w:pPr>
+      <w:r>
+        <w:rPr>
+          <w:rFonts w:ascii="Consolas" w:hAnsi="Consolas" w:cs="Consolas"/>
+          <w:sz w:val="17"/>
+        </w:rPr>
+        <w:t>}</w:t>
+      </w:r>
+    </w:p>
+    <w:p>
+      <w:pPr>
+        <w:spacing w:after="0" w:before="0" w:line="240" w:lineRule="auto"/>
+      </w:pPr>
+      <w:r>
+        <w:rPr>
+          <w:rFonts w:ascii="Consolas" w:hAnsi="Consolas" w:cs="Consolas"/>
+          <w:sz w:val="17"/>
+        </w:rPr>
+        <w:t>else if (colore == 'G') {</w:t>
+      </w:r>
+    </w:p>
+    <w:p>
+      <w:pPr>
+        <w:spacing w:after="0" w:before="0" w:line="240" w:lineRule="auto"/>
+      </w:pPr>
+      <w:r>
+        <w:rPr>
+          <w:rFonts w:ascii="Consolas" w:hAnsi="Consolas" w:cs="Consolas"/>
+          <w:sz w:val="17"/>
+        </w:rPr>
+        <w:t xml:space="preserve">    printf("Attenzione, rallenta.\n");</w:t>
+      </w:r>
+    </w:p>
+    <w:p>
+      <w:pPr>
+        <w:spacing w:after="0" w:before="0" w:line="240" w:lineRule="auto"/>
+      </w:pPr>
+      <w:r>
+        <w:rPr>
+          <w:rFonts w:ascii="Consolas" w:hAnsi="Consolas" w:cs="Consolas"/>
+          <w:sz w:val="17"/>
+        </w:rPr>
+        <w:t>}</w:t>
+      </w:r>
+    </w:p>
+    <w:p>
+      <w:pPr>
+        <w:spacing w:after="0" w:before="0" w:line="240" w:lineRule="auto"/>
+      </w:pPr>
+      <w:r>
+        <w:rPr>
+          <w:rFonts w:ascii="Consolas" w:hAnsi="Consolas" w:cs="Consolas"/>
+          <w:sz w:val="17"/>
+        </w:rPr>
+        <w:t>else if (colore == 'V') {</w:t>
+      </w:r>
+    </w:p>
+    <w:p>
+      <w:pPr>
+        <w:spacing w:after="0" w:before="0" w:line="240" w:lineRule="auto"/>
+      </w:pPr>
+      <w:r>
+        <w:rPr>
+          <w:rFonts w:ascii="Consolas" w:hAnsi="Consolas" w:cs="Consolas"/>
+          <w:sz w:val="17"/>
+        </w:rPr>
+        <w:t xml:space="preserve">    printf("Puoi passare.\n");</w:t>
+      </w:r>
+    </w:p>
+    <w:p>
+      <w:pPr>
+        <w:spacing w:after="0" w:before="0" w:line="240" w:lineRule="auto"/>
+      </w:pPr>
+      <w:r>
+        <w:rPr>
+          <w:rFonts w:ascii="Consolas" w:hAnsi="Consolas" w:cs="Consolas"/>
+          <w:sz w:val="17"/>
+        </w:rPr>
+        <w:t>}</w:t>
+      </w:r>
+    </w:p>
+    <w:p>
+      <w:pPr>
+        <w:spacing w:after="0" w:before="0" w:line="240" w:lineRule="auto"/>
+      </w:pPr>
+      <w:r>
+        <w:rPr>
+          <w:rFonts w:ascii="Consolas" w:hAnsi="Consolas" w:cs="Consolas"/>
+          <w:sz w:val="17"/>
+        </w:rPr>
+        <w:t>else {</w:t>
+      </w:r>
+    </w:p>
+    <w:p>
+      <w:pPr>
+        <w:spacing w:after="0" w:before="0" w:line="240" w:lineRule="auto"/>
+      </w:pPr>
+      <w:r>
+        <w:rPr>
+          <w:rFonts w:ascii="Consolas" w:hAnsi="Consolas" w:cs="Consolas"/>
+          <w:sz w:val="17"/>
+        </w:rPr>
+        <w:t xml:space="preserve">    printf("Colore non valido!\n");</w:t>
+      </w:r>
+    </w:p>
+    <w:p>
+      <w:pPr>
+        <w:spacing w:after="0" w:before="0" w:line="240" w:lineRule="auto"/>
+      </w:pPr>
+      <w:r>
+        <w:rPr>
+          <w:rFonts w:ascii="Consolas" w:hAnsi="Consolas" w:cs="Consolas"/>
+          <w:sz w:val="17"/>
+        </w:rPr>
+        <w:t>}</w:t>
+      </w:r>
+    </w:p>
+    <w:p/>
+    <w:p>
+      <w:r>
+        <w:rPr/>
+        <w:t xml:space="preserve">Con colore uguale a 'G' il programma stampa </w:t>
+      </w:r>
+      <w:r>
+        <w:rPr>
+          <w:rFonts w:ascii="Consolas" w:hAnsi="Consolas" w:cs="Consolas"/>
+        </w:rPr>
+        <w:t>Attenzione, rallenta.</w:t>
+      </w:r>
+      <w:r>
+        <w:rPr/>
+        <w:t>; il blocco finale gestisce tutti i colori non previsti.</w:t>
+      </w:r>
+    </w:p>
+    <w:p>
+      <w:pPr>
+        <w:keepNext/>
+        <w:jc w:val="center"/>
+      </w:pPr>
+      <w:r>
+        <w:drawing>
+          <wp:inline xmlns:a="http://schemas.openxmlformats.org/drawingml/2006/main" xmlns:pic="http://schemas.openxmlformats.org/drawingml/2006/picture">
+            <wp:extent cx="5040000" cy="2261538"/>
+            <wp:docPr id="475959978" name="Picture 475959978"/>
+            <wp:cNvGraphicFramePr>
+              <a:graphicFrameLocks noChangeAspect="1"/>
+            </wp:cNvGraphicFramePr>
+            <a:graphic>
+              <a:graphicData uri="http://schemas.openxmlformats.org/drawingml/2006/picture">
+                <pic:pic>
+                  <pic:nvPicPr>
+                    <pic:cNvPr id="0" name="ch19_flusso_if.png"/>
+                    <pic:cNvPicPr/>
+                  </pic:nvPicPr>
+                  <pic:blipFill>
+                    <a:blip r:embed="rId27"/>
+                    <a:stretch>
+                      <a:fillRect/>
+                    </a:stretch>
+                  </pic:blipFill>
+                  <pic:spPr>
+                    <a:xfrm>
+                      <a:off x="0" y="0"/>
+                      <a:ext cx="5040000" cy="2261538"/>
+                    </a:xfrm>
+                    <a:prstGeom prst="rect"/>
+                  </pic:spPr>
+                </pic:pic>
+              </a:graphicData>
+            </a:graphic>
+          </wp:inline>
+        </w:drawing>
+      </w:r>
+    </w:p>
+    <w:p>
+      <w:pPr>
+        <w:jc w:val="center"/>
+      </w:pPr>
+      <w:r>
+        <w:rPr>
+          <w:i/>
+          <w:sz w:val="18"/>
+        </w:rPr>
+        <w:t>Il flusso di esecuzione di if, if-else e if-else if-else.</w:t>
+      </w:r>
+    </w:p>
+    <w:p>
+      <w:r>
+        <w:rPr/>
+        <w:t>Il prossimo capitolo raccoglie gli errori più comuni con questi costrutti, la visibilità delle variabili dentro i blocchi e alcuni schemi che si ripetono spesso.</w:t>
+      </w:r>
+    </w:p>
+    <w:p>
+      <w:pPr>
+        <w:pStyle w:val="Titolo1"/>
+      </w:pPr>
+      <w:r>
+        <w:rPr>
+          <w:b/>
+          <w:color w:val="EE0000"/>
+        </w:rPr>
+        <w:t>Capitolo 20: Errori Comuni, Visibilità nei Blocchi e Schemi con if</w:t>
+      </w:r>
+    </w:p>
+    <w:p>
+      <w:pPr>
+        <w:pStyle w:val="Titolo2"/>
+      </w:pPr>
+      <w:r>
+        <w:rPr>
+          <w:b/>
+          <w:color w:val="E97132"/>
+        </w:rPr>
+        <w:t>Gli errori più comuni</w:t>
+      </w:r>
+    </w:p>
+    <w:p>
+      <w:r>
+        <w:rPr/>
+        <w:t>Molti errori nei programmi nascono da piccoli errori sintattici o logici negli if. Conviene conoscere quelli più frequenti.</w:t>
+      </w:r>
+    </w:p>
+    <w:p>
+      <w:r>
+        <w:rPr>
+          <w:b/>
+        </w:rPr>
+        <w:t>Usare = invece di ==.</w:t>
+      </w:r>
+      <w:r>
+        <w:rPr/>
+        <w:t xml:space="preserve"> Scrivere </w:t>
+      </w:r>
+      <w:r>
+        <w:rPr>
+          <w:rFonts w:ascii="Consolas" w:hAnsi="Consolas" w:cs="Consolas"/>
+        </w:rPr>
+        <w:t>if (a = 5) { ... }</w:t>
+      </w:r>
+      <w:r>
+        <w:rPr/>
+        <w:t xml:space="preserve"> è un errore logico: </w:t>
+      </w:r>
+      <w:r>
+        <w:rPr>
+          <w:rFonts w:ascii="Consolas" w:hAnsi="Consolas" w:cs="Consolas"/>
+        </w:rPr>
+        <w:t>=</w:t>
+      </w:r>
+      <w:r>
+        <w:rPr/>
+        <w:t xml:space="preserve"> è un assegnamento, non un confronto. Il programma compila, ma non verifica se a vale 5: assegna 5 ad a, e la condizione vale quindi 5, cioè è sempre vera.</w:t>
+      </w:r>
+    </w:p>
+    <w:p>
+      <w:r>
+        <w:rPr>
+          <w:b/>
+        </w:rPr>
+        <w:t>Dimenticare le graffe.</w:t>
+      </w:r>
+      <w:r>
+        <w:rPr/>
+        <w:t xml:space="preserve"> In C è consentito omettere le parentesi graffe se dopo l'if c'è una sola istruzione, ma questo può generare errori poco visibili:</w:t>
+      </w:r>
+    </w:p>
+    <w:p>
+      <w:pPr>
+        <w:spacing w:after="0" w:before="0" w:line="240" w:lineRule="auto"/>
+      </w:pPr>
+      <w:r>
+        <w:rPr>
+          <w:rFonts w:ascii="Consolas" w:hAnsi="Consolas" w:cs="Consolas"/>
+          <w:sz w:val="17"/>
+        </w:rPr>
+        <w:t>if (x &gt; 0)</w:t>
+      </w:r>
+    </w:p>
+    <w:p>
+      <w:pPr>
+        <w:spacing w:after="0" w:before="0" w:line="240" w:lineRule="auto"/>
+      </w:pPr>
+      <w:r>
+        <w:rPr>
+          <w:rFonts w:ascii="Consolas" w:hAnsi="Consolas" w:cs="Consolas"/>
+          <w:sz w:val="17"/>
+        </w:rPr>
+        <w:t xml:space="preserve">    printf("Positivo\n");</w:t>
+      </w:r>
+    </w:p>
+    <w:p>
+      <w:pPr>
+        <w:spacing w:after="0" w:before="0" w:line="240" w:lineRule="auto"/>
+      </w:pPr>
+      <w:r>
+        <w:rPr>
+          <w:rFonts w:ascii="Consolas" w:hAnsi="Consolas" w:cs="Consolas"/>
+          <w:sz w:val="17"/>
+        </w:rPr>
+        <w:t xml:space="preserve">    printf("Errore!\n");   // eseguito sempre</w:t>
+      </w:r>
+    </w:p>
+    <w:p/>
+    <w:p>
+      <w:r>
+        <w:rPr/>
+        <w:t>La seconda printf non dipende dall'if, anche se l'indentazione lo suggerisce, e viene eseguita comunque. Per chiarezza è meglio usare sempre le graffe, anche con una sola istruzione, salvo casi davvero ovvi.</w:t>
+      </w:r>
+    </w:p>
+    <w:p>
+      <w:r>
+        <w:rPr>
+          <w:b/>
+        </w:rPr>
+        <w:t>Ordine sbagliato delle condizioni.</w:t>
+      </w:r>
+      <w:r>
+        <w:rPr/>
+        <w:t xml:space="preserve"> Nell'if-else if le condizioni si controllano nell'ordine in cui sono scritte, e si esce al primo blocco la cui condizione è vera:</w:t>
+      </w:r>
+    </w:p>
+    <w:p>
+      <w:pPr>
+        <w:spacing w:after="0" w:before="0" w:line="240" w:lineRule="auto"/>
+      </w:pPr>
+      <w:r>
+        <w:rPr>
+          <w:rFonts w:ascii="Consolas" w:hAnsi="Consolas" w:cs="Consolas"/>
+          <w:sz w:val="17"/>
+        </w:rPr>
+        <w:t>if (num % 2 == 0) {</w:t>
+      </w:r>
+    </w:p>
+    <w:p>
+      <w:pPr>
+        <w:spacing w:after="0" w:before="0" w:line="240" w:lineRule="auto"/>
+      </w:pPr>
+      <w:r>
+        <w:rPr>
+          <w:rFonts w:ascii="Consolas" w:hAnsi="Consolas" w:cs="Consolas"/>
+          <w:sz w:val="17"/>
+        </w:rPr>
+        <w:t xml:space="preserve">    printf("Pari non nullo\n");</w:t>
+      </w:r>
+    </w:p>
+    <w:p>
+      <w:pPr>
+        <w:spacing w:after="0" w:before="0" w:line="240" w:lineRule="auto"/>
+      </w:pPr>
+      <w:r>
+        <w:rPr>
+          <w:rFonts w:ascii="Consolas" w:hAnsi="Consolas" w:cs="Consolas"/>
+          <w:sz w:val="17"/>
+        </w:rPr>
+        <w:t>}</w:t>
+      </w:r>
+    </w:p>
+    <w:p>
+      <w:pPr>
+        <w:spacing w:after="0" w:before="0" w:line="240" w:lineRule="auto"/>
+      </w:pPr>
+      <w:r>
+        <w:rPr>
+          <w:rFonts w:ascii="Consolas" w:hAnsi="Consolas" w:cs="Consolas"/>
+          <w:sz w:val="17"/>
+        </w:rPr>
+        <w:t>else if (num == 0) {</w:t>
+      </w:r>
+    </w:p>
+    <w:p>
+      <w:pPr>
+        <w:spacing w:after="0" w:before="0" w:line="240" w:lineRule="auto"/>
+      </w:pPr>
+      <w:r>
+        <w:rPr>
+          <w:rFonts w:ascii="Consolas" w:hAnsi="Consolas" w:cs="Consolas"/>
+          <w:sz w:val="17"/>
+        </w:rPr>
+        <w:t xml:space="preserve">    printf("Zero\n");   // mai raggiunto</w:t>
+      </w:r>
+    </w:p>
+    <w:p>
+      <w:pPr>
+        <w:spacing w:after="0" w:before="0" w:line="240" w:lineRule="auto"/>
+      </w:pPr>
+      <w:r>
+        <w:rPr>
+          <w:rFonts w:ascii="Consolas" w:hAnsi="Consolas" w:cs="Consolas"/>
+          <w:sz w:val="17"/>
+        </w:rPr>
+        <w:t>}</w:t>
+      </w:r>
+    </w:p>
+    <w:p/>
+    <w:p>
+      <w:r>
+        <w:rPr/>
+        <w:t>Lo zero è pari, quindi entra già nel primo blocco e il secondo non viene mai raggiunto. Si corregge controllando prima i casi più specifici:</w:t>
+      </w:r>
+    </w:p>
+    <w:p>
+      <w:pPr>
+        <w:spacing w:after="0" w:before="0" w:line="240" w:lineRule="auto"/>
+      </w:pPr>
+      <w:r>
+        <w:rPr>
+          <w:rFonts w:ascii="Consolas" w:hAnsi="Consolas" w:cs="Consolas"/>
+          <w:sz w:val="17"/>
+        </w:rPr>
+        <w:t>if (num == 0) {</w:t>
+      </w:r>
+    </w:p>
+    <w:p>
+      <w:pPr>
+        <w:spacing w:after="0" w:before="0" w:line="240" w:lineRule="auto"/>
+      </w:pPr>
+      <w:r>
+        <w:rPr>
+          <w:rFonts w:ascii="Consolas" w:hAnsi="Consolas" w:cs="Consolas"/>
+          <w:sz w:val="17"/>
+        </w:rPr>
+        <w:t xml:space="preserve">    printf("Zero\n");</w:t>
+      </w:r>
+    </w:p>
+    <w:p>
+      <w:pPr>
+        <w:spacing w:after="0" w:before="0" w:line="240" w:lineRule="auto"/>
+      </w:pPr>
+      <w:r>
+        <w:rPr>
+          <w:rFonts w:ascii="Consolas" w:hAnsi="Consolas" w:cs="Consolas"/>
+          <w:sz w:val="17"/>
+        </w:rPr>
+        <w:t>}</w:t>
+      </w:r>
+    </w:p>
+    <w:p>
+      <w:pPr>
+        <w:spacing w:after="0" w:before="0" w:line="240" w:lineRule="auto"/>
+      </w:pPr>
+      <w:r>
+        <w:rPr>
+          <w:rFonts w:ascii="Consolas" w:hAnsi="Consolas" w:cs="Consolas"/>
+          <w:sz w:val="17"/>
+        </w:rPr>
+        <w:t>else if (num % 2 == 0) {</w:t>
+      </w:r>
+    </w:p>
+    <w:p>
+      <w:pPr>
+        <w:spacing w:after="0" w:before="0" w:line="240" w:lineRule="auto"/>
+      </w:pPr>
+      <w:r>
+        <w:rPr>
+          <w:rFonts w:ascii="Consolas" w:hAnsi="Consolas" w:cs="Consolas"/>
+          <w:sz w:val="17"/>
+        </w:rPr>
+        <w:t xml:space="preserve">    printf("Pari non nullo\n");</w:t>
+      </w:r>
+    </w:p>
+    <w:p>
+      <w:pPr>
+        <w:spacing w:after="0" w:before="0" w:line="240" w:lineRule="auto"/>
+      </w:pPr>
+      <w:r>
+        <w:rPr>
+          <w:rFonts w:ascii="Consolas" w:hAnsi="Consolas" w:cs="Consolas"/>
+          <w:sz w:val="17"/>
+        </w:rPr>
+        <w:t>}</w:t>
+      </w:r>
+    </w:p>
+    <w:p/>
+    <w:p>
+      <w:r>
+        <w:rPr>
+          <w:b/>
+        </w:rPr>
+        <w:t>Condizioni ridondanti o mai vere.</w:t>
+      </w:r>
+      <w:r>
+        <w:rPr/>
+        <w:t xml:space="preserve"> In questo esempio i due blocchi finali non vengono mai eseguiti, perché ogni valore maggiore di 20 o di 50 è anche maggiore di 10 ed entra già nel primo blocco:</w:t>
+      </w:r>
+    </w:p>
+    <w:p>
+      <w:pPr>
+        <w:spacing w:after="0" w:before="0" w:line="240" w:lineRule="auto"/>
+      </w:pPr>
+      <w:r>
+        <w:rPr>
+          <w:rFonts w:ascii="Consolas" w:hAnsi="Consolas" w:cs="Consolas"/>
+          <w:sz w:val="17"/>
+        </w:rPr>
+        <w:t>if (x &gt; 10) {</w:t>
+      </w:r>
+    </w:p>
+    <w:p>
+      <w:pPr>
+        <w:spacing w:after="0" w:before="0" w:line="240" w:lineRule="auto"/>
+      </w:pPr>
+      <w:r>
+        <w:rPr>
+          <w:rFonts w:ascii="Consolas" w:hAnsi="Consolas" w:cs="Consolas"/>
+          <w:sz w:val="17"/>
+        </w:rPr>
+        <w:t xml:space="preserve">    ...</w:t>
+      </w:r>
+    </w:p>
+    <w:p>
+      <w:pPr>
+        <w:spacing w:after="0" w:before="0" w:line="240" w:lineRule="auto"/>
+      </w:pPr>
+      <w:r>
+        <w:rPr>
+          <w:rFonts w:ascii="Consolas" w:hAnsi="Consolas" w:cs="Consolas"/>
+          <w:sz w:val="17"/>
+        </w:rPr>
+        <w:t>}</w:t>
+      </w:r>
+    </w:p>
+    <w:p>
+      <w:pPr>
+        <w:spacing w:after="0" w:before="0" w:line="240" w:lineRule="auto"/>
+      </w:pPr>
+      <w:r>
+        <w:rPr>
+          <w:rFonts w:ascii="Consolas" w:hAnsi="Consolas" w:cs="Consolas"/>
+          <w:sz w:val="17"/>
+        </w:rPr>
+        <w:t>else if (x &gt; 20) {</w:t>
+      </w:r>
+    </w:p>
+    <w:p>
+      <w:pPr>
+        <w:spacing w:after="0" w:before="0" w:line="240" w:lineRule="auto"/>
+      </w:pPr>
+      <w:r>
+        <w:rPr>
+          <w:rFonts w:ascii="Consolas" w:hAnsi="Consolas" w:cs="Consolas"/>
+          <w:sz w:val="17"/>
+        </w:rPr>
+        <w:t xml:space="preserve">    ...   // mai eseguito!</w:t>
+      </w:r>
+    </w:p>
+    <w:p>
+      <w:pPr>
+        <w:spacing w:after="0" w:before="0" w:line="240" w:lineRule="auto"/>
+      </w:pPr>
+      <w:r>
+        <w:rPr>
+          <w:rFonts w:ascii="Consolas" w:hAnsi="Consolas" w:cs="Consolas"/>
+          <w:sz w:val="17"/>
+        </w:rPr>
+        <w:t>}</w:t>
+      </w:r>
+    </w:p>
+    <w:p>
+      <w:pPr>
+        <w:spacing w:after="0" w:before="0" w:line="240" w:lineRule="auto"/>
+      </w:pPr>
+      <w:r>
+        <w:rPr>
+          <w:rFonts w:ascii="Consolas" w:hAnsi="Consolas" w:cs="Consolas"/>
+          <w:sz w:val="17"/>
+        </w:rPr>
+        <w:t>else if (x &gt; 50) {</w:t>
+      </w:r>
+    </w:p>
+    <w:p>
+      <w:pPr>
+        <w:spacing w:after="0" w:before="0" w:line="240" w:lineRule="auto"/>
+      </w:pPr>
+      <w:r>
+        <w:rPr>
+          <w:rFonts w:ascii="Consolas" w:hAnsi="Consolas" w:cs="Consolas"/>
+          <w:sz w:val="17"/>
+        </w:rPr>
+        <w:t xml:space="preserve">    ...   // mai eseguito!</w:t>
+      </w:r>
+    </w:p>
+    <w:p>
+      <w:pPr>
+        <w:spacing w:after="0" w:before="0" w:line="240" w:lineRule="auto"/>
+      </w:pPr>
+      <w:r>
+        <w:rPr>
+          <w:rFonts w:ascii="Consolas" w:hAnsi="Consolas" w:cs="Consolas"/>
+          <w:sz w:val="17"/>
+        </w:rPr>
+        <w:t>}</w:t>
+      </w:r>
+    </w:p>
+    <w:p/>
+    <w:p>
+      <w:r>
+        <w:rPr/>
+        <w:t xml:space="preserve">Infine, è buona norma gestire sempre tutti i casi possibili del flusso, con un </w:t>
+      </w:r>
+      <w:r>
+        <w:rPr>
+          <w:b/>
+        </w:rPr>
+        <w:t>else</w:t>
+      </w:r>
+      <w:r>
+        <w:rPr/>
+        <w:t xml:space="preserve"> finale, così il programma non lascia situazioni non previste.</w:t>
+      </w:r>
+    </w:p>
+    <w:p>
+      <w:pPr>
+        <w:pStyle w:val="Titolo2"/>
+      </w:pPr>
+      <w:r>
+        <w:rPr>
+          <w:b/>
+          <w:color w:val="E97132"/>
+        </w:rPr>
+        <w:t>Suggerimenti e buona prassi</w:t>
+      </w:r>
+    </w:p>
+    <w:p>
+      <w:r>
+        <w:rPr/>
+        <w:t>Abituarsi a pensare ai casi limite evita brutte sorprese. Oltre a usare sempre le graffe e a ordinare le condizioni dal caso più specifico al più generale, come visto sopra, conviene mantenere le condizioni semplici e leggibili, spezzando quelle complesse con variabili booleane intermedie (capitolo 18):</w:t>
+      </w:r>
+    </w:p>
+    <w:p>
+      <w:pPr>
+        <w:spacing w:after="0" w:before="0" w:line="240" w:lineRule="auto"/>
+      </w:pPr>
+      <w:r>
+        <w:rPr>
+          <w:rFonts w:ascii="Consolas" w:hAnsi="Consolas" w:cs="Consolas"/>
+          <w:sz w:val="17"/>
+        </w:rPr>
+        <w:t>// difficile da leggere</w:t>
+      </w:r>
+    </w:p>
+    <w:p>
+      <w:pPr>
+        <w:spacing w:after="0" w:before="0" w:line="240" w:lineRule="auto"/>
+      </w:pPr>
+      <w:r>
+        <w:rPr>
+          <w:rFonts w:ascii="Consolas" w:hAnsi="Consolas" w:cs="Consolas"/>
+          <w:sz w:val="17"/>
+        </w:rPr>
+        <w:t>if (a &gt; 10 &amp;&amp; b &lt; 5 || c == 7 &amp;&amp; !(d % 2)) { ... }</w:t>
+      </w:r>
+    </w:p>
+    <w:p>
+      <w:pPr>
+        <w:spacing w:after="0" w:before="0" w:line="240" w:lineRule="auto"/>
+      </w:pPr>
+      <w:r>
+        <w:rPr>
+          <w:rFonts w:ascii="Consolas" w:hAnsi="Consolas" w:cs="Consolas"/>
+          <w:sz w:val="17"/>
+        </w:rPr>
+      </w:r>
+    </w:p>
+    <w:p>
+      <w:pPr>
+        <w:spacing w:after="0" w:before="0" w:line="240" w:lineRule="auto"/>
+      </w:pPr>
+      <w:r>
+        <w:rPr>
+          <w:rFonts w:ascii="Consolas" w:hAnsi="Consolas" w:cs="Consolas"/>
+          <w:sz w:val="17"/>
+        </w:rPr>
+        <w:t>// meglio</w:t>
+      </w:r>
+    </w:p>
+    <w:p>
+      <w:pPr>
+        <w:spacing w:after="0" w:before="0" w:line="240" w:lineRule="auto"/>
+      </w:pPr>
+      <w:r>
+        <w:rPr>
+          <w:rFonts w:ascii="Consolas" w:hAnsi="Consolas" w:cs="Consolas"/>
+          <w:sz w:val="17"/>
+        </w:rPr>
+        <w:t>bool condA = (a &gt; 10 &amp;&amp; b &lt; 5);</w:t>
+      </w:r>
+    </w:p>
+    <w:p>
+      <w:pPr>
+        <w:spacing w:after="0" w:before="0" w:line="240" w:lineRule="auto"/>
+      </w:pPr>
+      <w:r>
+        <w:rPr>
+          <w:rFonts w:ascii="Consolas" w:hAnsi="Consolas" w:cs="Consolas"/>
+          <w:sz w:val="17"/>
+        </w:rPr>
+        <w:t>bool condB = (c == 7 &amp;&amp; d % 2 == 0);</w:t>
+      </w:r>
+    </w:p>
+    <w:p>
+      <w:pPr>
+        <w:spacing w:after="0" w:before="0" w:line="240" w:lineRule="auto"/>
+      </w:pPr>
+      <w:r>
+        <w:rPr>
+          <w:rFonts w:ascii="Consolas" w:hAnsi="Consolas" w:cs="Consolas"/>
+          <w:sz w:val="17"/>
+        </w:rPr>
+        <w:t>if (condA || condB) { ... }</w:t>
+      </w:r>
+    </w:p>
+    <w:p/>
+    <w:p>
+      <w:pPr>
+        <w:pStyle w:val="Titolo2"/>
+      </w:pPr>
+      <w:r>
+        <w:rPr>
+          <w:b/>
+          <w:color w:val="E97132"/>
+        </w:rPr>
+        <w:t>Esempio: stampare due numeri in ordine</w:t>
+      </w:r>
+    </w:p>
+    <w:p>
+      <w:r>
+        <w:rPr/>
+        <w:t xml:space="preserve">Un esempio che usa l'if: si chiedono all'utente due interi x e y e si stampano dal minore (o uguale) al maggiore. Negli esempi del docente la funzione main compare come </w:t>
+      </w:r>
+      <w:r>
+        <w:rPr>
+          <w:rFonts w:ascii="Consolas" w:hAnsi="Consolas" w:cs="Consolas"/>
+        </w:rPr>
+        <w:t>void main()</w:t>
+      </w:r>
+      <w:r>
+        <w:rPr/>
+        <w:t xml:space="preserve">; qui usiamo la forma standard </w:t>
+      </w:r>
+      <w:r>
+        <w:rPr>
+          <w:rFonts w:ascii="Consolas" w:hAnsi="Consolas" w:cs="Consolas"/>
+        </w:rPr>
+        <w:t>int main(void)</w:t>
+      </w:r>
+      <w:r>
+        <w:rPr/>
+        <w:t xml:space="preserve"> e, come nei capitoli precedenti, omettiamo gli </w:t>
+      </w:r>
+      <w:r>
+        <w:rPr>
+          <w:rFonts w:ascii="Consolas" w:hAnsi="Consolas" w:cs="Consolas"/>
+        </w:rPr>
+        <w:t>#include</w:t>
+      </w:r>
+      <w:r>
+        <w:rPr/>
+        <w:t>. Una prima soluzione stampa i due numeri in ordine diverso nei due rami:</w:t>
+      </w:r>
+    </w:p>
+    <w:p>
+      <w:pPr>
+        <w:spacing w:after="0" w:before="0" w:line="240" w:lineRule="auto"/>
+      </w:pPr>
+      <w:r>
+        <w:rPr>
+          <w:rFonts w:ascii="Consolas" w:hAnsi="Consolas" w:cs="Consolas"/>
+          <w:sz w:val="17"/>
+        </w:rPr>
+        <w:t>int main(void) {</w:t>
+      </w:r>
+    </w:p>
+    <w:p>
+      <w:pPr>
+        <w:spacing w:after="0" w:before="0" w:line="240" w:lineRule="auto"/>
+      </w:pPr>
+      <w:r>
+        <w:rPr>
+          <w:rFonts w:ascii="Consolas" w:hAnsi="Consolas" w:cs="Consolas"/>
+          <w:sz w:val="17"/>
+        </w:rPr>
+        <w:t xml:space="preserve">    int x, y;</w:t>
+      </w:r>
+    </w:p>
+    <w:p>
+      <w:pPr>
+        <w:spacing w:after="0" w:before="0" w:line="240" w:lineRule="auto"/>
+      </w:pPr>
+      <w:r>
+        <w:rPr>
+          <w:rFonts w:ascii="Consolas" w:hAnsi="Consolas" w:cs="Consolas"/>
+          <w:sz w:val="17"/>
+        </w:rPr>
+        <w:t xml:space="preserve">    printf("Inserisci x:");</w:t>
+      </w:r>
+    </w:p>
+    <w:p>
+      <w:pPr>
+        <w:spacing w:after="0" w:before="0" w:line="240" w:lineRule="auto"/>
+      </w:pPr>
+      <w:r>
+        <w:rPr>
+          <w:rFonts w:ascii="Consolas" w:hAnsi="Consolas" w:cs="Consolas"/>
+          <w:sz w:val="17"/>
+        </w:rPr>
+        <w:t xml:space="preserve">    scanf("%d", &amp;x);</w:t>
+      </w:r>
+    </w:p>
+    <w:p>
+      <w:pPr>
+        <w:spacing w:after="0" w:before="0" w:line="240" w:lineRule="auto"/>
+      </w:pPr>
+      <w:r>
+        <w:rPr>
+          <w:rFonts w:ascii="Consolas" w:hAnsi="Consolas" w:cs="Consolas"/>
+          <w:sz w:val="17"/>
+        </w:rPr>
+        <w:t xml:space="preserve">    printf("Inserisci y:");</w:t>
+      </w:r>
+    </w:p>
+    <w:p>
+      <w:pPr>
+        <w:spacing w:after="0" w:before="0" w:line="240" w:lineRule="auto"/>
+      </w:pPr>
+      <w:r>
+        <w:rPr>
+          <w:rFonts w:ascii="Consolas" w:hAnsi="Consolas" w:cs="Consolas"/>
+          <w:sz w:val="17"/>
+        </w:rPr>
+        <w:t xml:space="preserve">    scanf("%d", &amp;y);</w:t>
+      </w:r>
+    </w:p>
+    <w:p>
+      <w:pPr>
+        <w:spacing w:after="0" w:before="0" w:line="240" w:lineRule="auto"/>
+      </w:pPr>
+      <w:r>
+        <w:rPr>
+          <w:rFonts w:ascii="Consolas" w:hAnsi="Consolas" w:cs="Consolas"/>
+          <w:sz w:val="17"/>
+        </w:rPr>
+        <w:t xml:space="preserve">    if (y &lt; x) {</w:t>
+      </w:r>
+    </w:p>
+    <w:p>
+      <w:pPr>
+        <w:spacing w:after="0" w:before="0" w:line="240" w:lineRule="auto"/>
+      </w:pPr>
+      <w:r>
+        <w:rPr>
+          <w:rFonts w:ascii="Consolas" w:hAnsi="Consolas" w:cs="Consolas"/>
+          <w:sz w:val="17"/>
+        </w:rPr>
+        <w:t xml:space="preserve">        printf("%d %d", y, x);</w:t>
+      </w:r>
+    </w:p>
+    <w:p>
+      <w:pPr>
+        <w:spacing w:after="0" w:before="0" w:line="240" w:lineRule="auto"/>
+      </w:pPr>
+      <w:r>
+        <w:rPr>
+          <w:rFonts w:ascii="Consolas" w:hAnsi="Consolas" w:cs="Consolas"/>
+          <w:sz w:val="17"/>
+        </w:rPr>
+        <w:t xml:space="preserve">    }</w:t>
+      </w:r>
+    </w:p>
+    <w:p>
+      <w:pPr>
+        <w:spacing w:after="0" w:before="0" w:line="240" w:lineRule="auto"/>
+      </w:pPr>
+      <w:r>
+        <w:rPr>
+          <w:rFonts w:ascii="Consolas" w:hAnsi="Consolas" w:cs="Consolas"/>
+          <w:sz w:val="17"/>
+        </w:rPr>
+        <w:t xml:space="preserve">    else {   // y &gt;= x</w:t>
+      </w:r>
+    </w:p>
+    <w:p>
+      <w:pPr>
+        <w:spacing w:after="0" w:before="0" w:line="240" w:lineRule="auto"/>
+      </w:pPr>
+      <w:r>
+        <w:rPr>
+          <w:rFonts w:ascii="Consolas" w:hAnsi="Consolas" w:cs="Consolas"/>
+          <w:sz w:val="17"/>
+        </w:rPr>
+        <w:t xml:space="preserve">        printf("%d %d", x, y);</w:t>
+      </w:r>
+    </w:p>
+    <w:p>
+      <w:pPr>
+        <w:spacing w:after="0" w:before="0" w:line="240" w:lineRule="auto"/>
+      </w:pPr>
+      <w:r>
+        <w:rPr>
+          <w:rFonts w:ascii="Consolas" w:hAnsi="Consolas" w:cs="Consolas"/>
+          <w:sz w:val="17"/>
+        </w:rPr>
+        <w:t xml:space="preserve">    }</w:t>
+      </w:r>
+    </w:p>
+    <w:p>
+      <w:pPr>
+        <w:spacing w:after="0" w:before="0" w:line="240" w:lineRule="auto"/>
+      </w:pPr>
+      <w:r>
+        <w:rPr>
+          <w:rFonts w:ascii="Consolas" w:hAnsi="Consolas" w:cs="Consolas"/>
+          <w:sz w:val="17"/>
+        </w:rPr>
+        <w:t>}</w:t>
+      </w:r>
+    </w:p>
+    <w:p/>
+    <w:p>
+      <w:r>
+        <w:rPr/>
+        <w:t xml:space="preserve">Una seconda soluzione fa invece uno </w:t>
+      </w:r>
+      <w:r>
+        <w:rPr>
+          <w:b/>
+        </w:rPr>
+        <w:t>scambio condizionato</w:t>
+      </w:r>
+      <w:r>
+        <w:rPr/>
+        <w:t>: se y è minore di x scambia i due valori, usando la variabile temporanea del capitolo 13, e poi stampa sempre x e y nello stesso ordine:</w:t>
+      </w:r>
+    </w:p>
+    <w:p>
+      <w:pPr>
+        <w:spacing w:after="0" w:before="0" w:line="240" w:lineRule="auto"/>
+      </w:pPr>
+      <w:r>
+        <w:rPr>
+          <w:rFonts w:ascii="Consolas" w:hAnsi="Consolas" w:cs="Consolas"/>
+          <w:sz w:val="17"/>
+        </w:rPr>
+        <w:t>int main(void) {</w:t>
+      </w:r>
+    </w:p>
+    <w:p>
+      <w:pPr>
+        <w:spacing w:after="0" w:before="0" w:line="240" w:lineRule="auto"/>
+      </w:pPr>
+      <w:r>
+        <w:rPr>
+          <w:rFonts w:ascii="Consolas" w:hAnsi="Consolas" w:cs="Consolas"/>
+          <w:sz w:val="17"/>
+        </w:rPr>
+        <w:t xml:space="preserve">    int x, y;</w:t>
+      </w:r>
+    </w:p>
+    <w:p>
+      <w:pPr>
+        <w:spacing w:after="0" w:before="0" w:line="240" w:lineRule="auto"/>
+      </w:pPr>
+      <w:r>
+        <w:rPr>
+          <w:rFonts w:ascii="Consolas" w:hAnsi="Consolas" w:cs="Consolas"/>
+          <w:sz w:val="17"/>
+        </w:rPr>
+        <w:t xml:space="preserve">    printf("Inserisci x:");</w:t>
+      </w:r>
+    </w:p>
+    <w:p>
+      <w:pPr>
+        <w:spacing w:after="0" w:before="0" w:line="240" w:lineRule="auto"/>
+      </w:pPr>
+      <w:r>
+        <w:rPr>
+          <w:rFonts w:ascii="Consolas" w:hAnsi="Consolas" w:cs="Consolas"/>
+          <w:sz w:val="17"/>
+        </w:rPr>
+        <w:t xml:space="preserve">    scanf("%d", &amp;x);</w:t>
+      </w:r>
+    </w:p>
+    <w:p>
+      <w:pPr>
+        <w:spacing w:after="0" w:before="0" w:line="240" w:lineRule="auto"/>
+      </w:pPr>
+      <w:r>
+        <w:rPr>
+          <w:rFonts w:ascii="Consolas" w:hAnsi="Consolas" w:cs="Consolas"/>
+          <w:sz w:val="17"/>
+        </w:rPr>
+        <w:t xml:space="preserve">    printf("Inserisci y:");</w:t>
+      </w:r>
+    </w:p>
+    <w:p>
+      <w:pPr>
+        <w:spacing w:after="0" w:before="0" w:line="240" w:lineRule="auto"/>
+      </w:pPr>
+      <w:r>
+        <w:rPr>
+          <w:rFonts w:ascii="Consolas" w:hAnsi="Consolas" w:cs="Consolas"/>
+          <w:sz w:val="17"/>
+        </w:rPr>
+        <w:t xml:space="preserve">    scanf("%d", &amp;y);</w:t>
+      </w:r>
+    </w:p>
+    <w:p>
+      <w:pPr>
+        <w:spacing w:after="0" w:before="0" w:line="240" w:lineRule="auto"/>
+      </w:pPr>
+      <w:r>
+        <w:rPr>
+          <w:rFonts w:ascii="Consolas" w:hAnsi="Consolas" w:cs="Consolas"/>
+          <w:sz w:val="17"/>
+        </w:rPr>
+        <w:t xml:space="preserve">    if (y &lt; x) {</w:t>
+      </w:r>
+    </w:p>
+    <w:p>
+      <w:pPr>
+        <w:spacing w:after="0" w:before="0" w:line="240" w:lineRule="auto"/>
+      </w:pPr>
+      <w:r>
+        <w:rPr>
+          <w:rFonts w:ascii="Consolas" w:hAnsi="Consolas" w:cs="Consolas"/>
+          <w:sz w:val="17"/>
+        </w:rPr>
+        <w:t xml:space="preserve">        // scambio condizionato</w:t>
+      </w:r>
+    </w:p>
+    <w:p>
+      <w:pPr>
+        <w:spacing w:after="0" w:before="0" w:line="240" w:lineRule="auto"/>
+      </w:pPr>
+      <w:r>
+        <w:rPr>
+          <w:rFonts w:ascii="Consolas" w:hAnsi="Consolas" w:cs="Consolas"/>
+          <w:sz w:val="17"/>
+        </w:rPr>
+        <w:t xml:space="preserve">        int temp = x;</w:t>
+      </w:r>
+    </w:p>
+    <w:p>
+      <w:pPr>
+        <w:spacing w:after="0" w:before="0" w:line="240" w:lineRule="auto"/>
+      </w:pPr>
+      <w:r>
+        <w:rPr>
+          <w:rFonts w:ascii="Consolas" w:hAnsi="Consolas" w:cs="Consolas"/>
+          <w:sz w:val="17"/>
+        </w:rPr>
+        <w:t xml:space="preserve">        x = y;</w:t>
+      </w:r>
+    </w:p>
+    <w:p>
+      <w:pPr>
+        <w:spacing w:after="0" w:before="0" w:line="240" w:lineRule="auto"/>
+      </w:pPr>
+      <w:r>
+        <w:rPr>
+          <w:rFonts w:ascii="Consolas" w:hAnsi="Consolas" w:cs="Consolas"/>
+          <w:sz w:val="17"/>
+        </w:rPr>
+        <w:t xml:space="preserve">        y = temp;</w:t>
+      </w:r>
+    </w:p>
+    <w:p>
+      <w:pPr>
+        <w:spacing w:after="0" w:before="0" w:line="240" w:lineRule="auto"/>
+      </w:pPr>
+      <w:r>
+        <w:rPr>
+          <w:rFonts w:ascii="Consolas" w:hAnsi="Consolas" w:cs="Consolas"/>
+          <w:sz w:val="17"/>
+        </w:rPr>
+        <w:t xml:space="preserve">    }</w:t>
+      </w:r>
+    </w:p>
+    <w:p>
+      <w:pPr>
+        <w:spacing w:after="0" w:before="0" w:line="240" w:lineRule="auto"/>
+      </w:pPr>
+      <w:r>
+        <w:rPr>
+          <w:rFonts w:ascii="Consolas" w:hAnsi="Consolas" w:cs="Consolas"/>
+          <w:sz w:val="17"/>
+        </w:rPr>
+        <w:t xml:space="preserve">    printf("%d %d", x, y);</w:t>
+      </w:r>
+    </w:p>
+    <w:p>
+      <w:pPr>
+        <w:spacing w:after="0" w:before="0" w:line="240" w:lineRule="auto"/>
+      </w:pPr>
+      <w:r>
+        <w:rPr>
+          <w:rFonts w:ascii="Consolas" w:hAnsi="Consolas" w:cs="Consolas"/>
+          <w:sz w:val="17"/>
+        </w:rPr>
+        <w:t>}</w:t>
+      </w:r>
+    </w:p>
+    <w:p/>
+    <w:p>
+      <w:pPr>
+        <w:pStyle w:val="Titolo2"/>
+      </w:pPr>
+      <w:r>
+        <w:rPr>
+          <w:b/>
+          <w:color w:val="E97132"/>
+        </w:rPr>
+        <w:t>Visibilità nei blocchi condizionati</w:t>
+      </w:r>
+    </w:p>
+    <w:p>
+      <w:r>
+        <w:rPr/>
+        <w:t xml:space="preserve">Nello scambio condizionato la variabile </w:t>
+      </w:r>
+      <w:r>
+        <w:rPr>
+          <w:rFonts w:ascii="Consolas" w:hAnsi="Consolas" w:cs="Consolas"/>
+        </w:rPr>
+        <w:t>temp</w:t>
+      </w:r>
+      <w:r>
+        <w:rPr/>
+        <w:t xml:space="preserve"> è dichiarata </w:t>
+      </w:r>
+      <w:r>
+        <w:rPr>
+          <w:b/>
+        </w:rPr>
+        <w:t>dentro il blocco</w:t>
+      </w:r>
+      <w:r>
+        <w:rPr/>
+        <w:t xml:space="preserve"> dell'if. Seguiamo l'esecuzione con x = 10 e y = 5, quando la condizione </w:t>
+      </w:r>
+      <w:r>
+        <w:rPr>
+          <w:rFonts w:ascii="Consolas" w:hAnsi="Consolas" w:cs="Consolas"/>
+        </w:rPr>
+        <w:t>y &lt; x</w:t>
+      </w:r>
+      <w:r>
+        <w:rPr/>
+        <w:t xml:space="preserve"> è vera:</w:t>
+      </w:r>
+    </w:p>
+    <w:p>
+      <w:pPr>
+        <w:numPr>
+          <w:ilvl w:val="0"/>
+          <w:numId w:val="1"/>
+        </w:numPr>
+      </w:pPr>
+      <w:r>
+        <w:rPr/>
+        <w:t>all'inizio sullo stack ci sono solo x e y, con i valori inseriti;</w:t>
+      </w:r>
+    </w:p>
+    <w:p>
+      <w:pPr>
+        <w:numPr>
+          <w:ilvl w:val="0"/>
+          <w:numId w:val="1"/>
+        </w:numPr>
+      </w:pPr>
+      <w:r>
+        <w:rPr/>
+        <w:t>entrando nel blocco, la dichiarazione di temp la rende visibile e la inizializza a 10;</w:t>
+      </w:r>
+    </w:p>
+    <w:p>
+      <w:pPr>
+        <w:numPr>
+          <w:ilvl w:val="0"/>
+          <w:numId w:val="1"/>
+        </w:numPr>
+      </w:pPr>
+      <w:r>
+        <w:rPr>
+          <w:rFonts w:ascii="Consolas" w:hAnsi="Consolas" w:cs="Consolas"/>
+        </w:rPr>
+        <w:t>x = y;</w:t>
+      </w:r>
+      <w:r>
+        <w:rPr/>
+        <w:t xml:space="preserve"> copia 5 in x e </w:t>
+      </w:r>
+      <w:r>
+        <w:rPr>
+          <w:rFonts w:ascii="Consolas" w:hAnsi="Consolas" w:cs="Consolas"/>
+        </w:rPr>
+        <w:t>y = temp;</w:t>
+      </w:r>
+      <w:r>
+        <w:rPr/>
+        <w:t xml:space="preserve"> copia 10 in y: i valori sono scambiati;</w:t>
+      </w:r>
+    </w:p>
+    <w:p>
+      <w:pPr>
+        <w:numPr>
+          <w:ilvl w:val="0"/>
+          <w:numId w:val="1"/>
+        </w:numPr>
+      </w:pPr>
+      <w:r>
+        <w:rPr/>
+        <w:t>all'uscita dal blocco, temp esce dalla visibilità: viene rimossa dallo stack e non è più accessibile.</w:t>
+      </w:r>
+    </w:p>
+    <w:p>
+      <w:r>
+        <w:rPr/>
+        <w:t xml:space="preserve">Il programma stampa </w:t>
+      </w:r>
+      <w:r>
+        <w:rPr>
+          <w:rFonts w:ascii="Consolas" w:hAnsi="Consolas" w:cs="Consolas"/>
+        </w:rPr>
+        <w:t>5 10</w:t>
+      </w:r>
+      <w:r>
+        <w:rPr/>
+        <w:t xml:space="preserve">. Come nel capitolo 7, la </w:t>
+      </w:r>
+      <w:r>
+        <w:rPr>
+          <w:b/>
+        </w:rPr>
+        <w:t>visibilità</w:t>
+      </w:r>
+      <w:r>
+        <w:rPr/>
+        <w:t xml:space="preserve"> (scope) di una variabile è quindi limitata al blocco in cui è dichiarata, e la sua durata (lifetime) finisce quando il blocco termina.</w:t>
+      </w:r>
+    </w:p>
+    <w:p>
+      <w:pPr>
+        <w:keepNext/>
+        <w:jc w:val="center"/>
+      </w:pPr>
+      <w:r>
+        <w:drawing>
+          <wp:inline xmlns:a="http://schemas.openxmlformats.org/drawingml/2006/main" xmlns:pic="http://schemas.openxmlformats.org/drawingml/2006/picture">
+            <wp:extent cx="4680000" cy="2244684"/>
+            <wp:docPr id="475959979" name="Picture 475959979"/>
+            <wp:cNvGraphicFramePr>
+              <a:graphicFrameLocks noChangeAspect="1"/>
+            </wp:cNvGraphicFramePr>
+            <a:graphic>
+              <a:graphicData uri="http://schemas.openxmlformats.org/drawingml/2006/picture">
+                <pic:pic>
+                  <pic:nvPicPr>
+                    <pic:cNvPr id="0" name="ch20_scambio_condizionato.png"/>
+                    <pic:cNvPicPr/>
+                  </pic:nvPicPr>
+                  <pic:blipFill>
+                    <a:blip r:embed="rId28"/>
+                    <a:stretch>
+                      <a:fillRect/>
+                    </a:stretch>
+                  </pic:blipFill>
+                  <pic:spPr>
+                    <a:xfrm>
+                      <a:off x="0" y="0"/>
+                      <a:ext cx="4680000" cy="2244684"/>
+                    </a:xfrm>
+                    <a:prstGeom prst="rect"/>
+                  </pic:spPr>
+                </pic:pic>
+              </a:graphicData>
+            </a:graphic>
+          </wp:inline>
+        </w:drawing>
+      </w:r>
+    </w:p>
+    <w:p>
+      <w:pPr>
+        <w:jc w:val="center"/>
+      </w:pPr>
+      <w:r>
+        <w:rPr>
+          <w:i/>
+          <w:sz w:val="18"/>
+        </w:rPr>
+        <w:t>Lo scambio condizionato: temp esiste solo dentro il blocco dell'if (in rosso le celle che cambiano).</w:t>
+      </w:r>
+    </w:p>
+    <w:p>
+      <w:pPr>
+        <w:pStyle w:val="Titolo2"/>
+      </w:pPr>
+      <w:r>
+        <w:rPr>
+          <w:b/>
+          <w:color w:val="E97132"/>
+        </w:rPr>
+        <w:t>Annidamenti non necessari</w:t>
+      </w:r>
+    </w:p>
+    <w:p>
+      <w:r>
+        <w:rPr/>
+        <w:t>Conviene evitare gli annidamenti multipli di if quando non servono, perché rendono il codice meno chiaro. Questo programma calcola il biglietto in base all'età, usando un if dentro un else:</w:t>
+      </w:r>
+    </w:p>
+    <w:p>
+      <w:pPr>
+        <w:spacing w:after="0" w:before="0" w:line="240" w:lineRule="auto"/>
+      </w:pPr>
+      <w:r>
+        <w:rPr>
+          <w:rFonts w:ascii="Consolas" w:hAnsi="Consolas" w:cs="Consolas"/>
+          <w:sz w:val="17"/>
+        </w:rPr>
+        <w:t>int eta;</w:t>
+      </w:r>
+    </w:p>
+    <w:p>
+      <w:pPr>
+        <w:spacing w:after="0" w:before="0" w:line="240" w:lineRule="auto"/>
+      </w:pPr>
+      <w:r>
+        <w:rPr>
+          <w:rFonts w:ascii="Consolas" w:hAnsi="Consolas" w:cs="Consolas"/>
+          <w:sz w:val="17"/>
+        </w:rPr>
+        <w:t>printf("Inserisci la tua età: ");</w:t>
+      </w:r>
+    </w:p>
+    <w:p>
+      <w:pPr>
+        <w:spacing w:after="0" w:before="0" w:line="240" w:lineRule="auto"/>
+      </w:pPr>
+      <w:r>
+        <w:rPr>
+          <w:rFonts w:ascii="Consolas" w:hAnsi="Consolas" w:cs="Consolas"/>
+          <w:sz w:val="17"/>
+        </w:rPr>
+        <w:t>scanf("%d", &amp;eta);</w:t>
+      </w:r>
+    </w:p>
+    <w:p>
+      <w:pPr>
+        <w:spacing w:after="0" w:before="0" w:line="240" w:lineRule="auto"/>
+      </w:pPr>
+      <w:r>
+        <w:rPr>
+          <w:rFonts w:ascii="Consolas" w:hAnsi="Consolas" w:cs="Consolas"/>
+          <w:sz w:val="17"/>
+        </w:rPr>
+        <w:t>if (eta &lt; 6) {</w:t>
+      </w:r>
+    </w:p>
+    <w:p>
+      <w:pPr>
+        <w:spacing w:after="0" w:before="0" w:line="240" w:lineRule="auto"/>
+      </w:pPr>
+      <w:r>
+        <w:rPr>
+          <w:rFonts w:ascii="Consolas" w:hAnsi="Consolas" w:cs="Consolas"/>
+          <w:sz w:val="17"/>
+        </w:rPr>
+        <w:t xml:space="preserve">    printf("Biglietto gratuito\n");</w:t>
+      </w:r>
+    </w:p>
+    <w:p>
+      <w:pPr>
+        <w:spacing w:after="0" w:before="0" w:line="240" w:lineRule="auto"/>
+      </w:pPr>
+      <w:r>
+        <w:rPr>
+          <w:rFonts w:ascii="Consolas" w:hAnsi="Consolas" w:cs="Consolas"/>
+          <w:sz w:val="17"/>
+        </w:rPr>
+        <w:t>}</w:t>
+      </w:r>
+    </w:p>
+    <w:p>
+      <w:pPr>
+        <w:spacing w:after="0" w:before="0" w:line="240" w:lineRule="auto"/>
+      </w:pPr>
+      <w:r>
+        <w:rPr>
+          <w:rFonts w:ascii="Consolas" w:hAnsi="Consolas" w:cs="Consolas"/>
+          <w:sz w:val="17"/>
+        </w:rPr>
+        <w:t>else {</w:t>
+      </w:r>
+    </w:p>
+    <w:p>
+      <w:pPr>
+        <w:spacing w:after="0" w:before="0" w:line="240" w:lineRule="auto"/>
+      </w:pPr>
+      <w:r>
+        <w:rPr>
+          <w:rFonts w:ascii="Consolas" w:hAnsi="Consolas" w:cs="Consolas"/>
+          <w:sz w:val="17"/>
+        </w:rPr>
+        <w:t xml:space="preserve">    if (eta &lt; 18) {</w:t>
+      </w:r>
+    </w:p>
+    <w:p>
+      <w:pPr>
+        <w:spacing w:after="0" w:before="0" w:line="240" w:lineRule="auto"/>
+      </w:pPr>
+      <w:r>
+        <w:rPr>
+          <w:rFonts w:ascii="Consolas" w:hAnsi="Consolas" w:cs="Consolas"/>
+          <w:sz w:val="17"/>
+        </w:rPr>
+        <w:t xml:space="preserve">        printf("Biglietto ridotto\n");</w:t>
+      </w:r>
+    </w:p>
+    <w:p>
+      <w:pPr>
+        <w:spacing w:after="0" w:before="0" w:line="240" w:lineRule="auto"/>
+      </w:pPr>
+      <w:r>
+        <w:rPr>
+          <w:rFonts w:ascii="Consolas" w:hAnsi="Consolas" w:cs="Consolas"/>
+          <w:sz w:val="17"/>
+        </w:rPr>
+        <w:t xml:space="preserve">    }</w:t>
+      </w:r>
+    </w:p>
+    <w:p>
+      <w:pPr>
+        <w:spacing w:after="0" w:before="0" w:line="240" w:lineRule="auto"/>
+      </w:pPr>
+      <w:r>
+        <w:rPr>
+          <w:rFonts w:ascii="Consolas" w:hAnsi="Consolas" w:cs="Consolas"/>
+          <w:sz w:val="17"/>
+        </w:rPr>
+        <w:t xml:space="preserve">    else {</w:t>
+      </w:r>
+    </w:p>
+    <w:p>
+      <w:pPr>
+        <w:spacing w:after="0" w:before="0" w:line="240" w:lineRule="auto"/>
+      </w:pPr>
+      <w:r>
+        <w:rPr>
+          <w:rFonts w:ascii="Consolas" w:hAnsi="Consolas" w:cs="Consolas"/>
+          <w:sz w:val="17"/>
+        </w:rPr>
+        <w:t xml:space="preserve">        printf("Biglietto intero\n");</w:t>
+      </w:r>
+    </w:p>
+    <w:p>
+      <w:pPr>
+        <w:spacing w:after="0" w:before="0" w:line="240" w:lineRule="auto"/>
+      </w:pPr>
+      <w:r>
+        <w:rPr>
+          <w:rFonts w:ascii="Consolas" w:hAnsi="Consolas" w:cs="Consolas"/>
+          <w:sz w:val="17"/>
+        </w:rPr>
+        <w:t xml:space="preserve">    }</w:t>
+      </w:r>
+    </w:p>
+    <w:p>
+      <w:pPr>
+        <w:spacing w:after="0" w:before="0" w:line="240" w:lineRule="auto"/>
+      </w:pPr>
+      <w:r>
+        <w:rPr>
+          <w:rFonts w:ascii="Consolas" w:hAnsi="Consolas" w:cs="Consolas"/>
+          <w:sz w:val="17"/>
+        </w:rPr>
+        <w:t>}</w:t>
+      </w:r>
+    </w:p>
+    <w:p/>
+    <w:p>
+      <w:r>
+        <w:rPr/>
+        <w:t>Lo stesso comportamento si ottiene, in modo più leggibile, con un if-else if-else senza annidamenti:</w:t>
+      </w:r>
+    </w:p>
+    <w:p>
+      <w:pPr>
+        <w:spacing w:after="0" w:before="0" w:line="240" w:lineRule="auto"/>
+      </w:pPr>
+      <w:r>
+        <w:rPr>
+          <w:rFonts w:ascii="Consolas" w:hAnsi="Consolas" w:cs="Consolas"/>
+          <w:sz w:val="17"/>
+        </w:rPr>
+        <w:t>if (eta &lt; 6) {</w:t>
+      </w:r>
+    </w:p>
+    <w:p>
+      <w:pPr>
+        <w:spacing w:after="0" w:before="0" w:line="240" w:lineRule="auto"/>
+      </w:pPr>
+      <w:r>
+        <w:rPr>
+          <w:rFonts w:ascii="Consolas" w:hAnsi="Consolas" w:cs="Consolas"/>
+          <w:sz w:val="17"/>
+        </w:rPr>
+        <w:t xml:space="preserve">    printf("Biglietto gratuito\n");</w:t>
+      </w:r>
+    </w:p>
+    <w:p>
+      <w:pPr>
+        <w:spacing w:after="0" w:before="0" w:line="240" w:lineRule="auto"/>
+      </w:pPr>
+      <w:r>
+        <w:rPr>
+          <w:rFonts w:ascii="Consolas" w:hAnsi="Consolas" w:cs="Consolas"/>
+          <w:sz w:val="17"/>
+        </w:rPr>
+        <w:t>}</w:t>
+      </w:r>
+    </w:p>
+    <w:p>
+      <w:pPr>
+        <w:spacing w:after="0" w:before="0" w:line="240" w:lineRule="auto"/>
+      </w:pPr>
+      <w:r>
+        <w:rPr>
+          <w:rFonts w:ascii="Consolas" w:hAnsi="Consolas" w:cs="Consolas"/>
+          <w:sz w:val="17"/>
+        </w:rPr>
+        <w:t>else if (eta &lt; 18) {</w:t>
+      </w:r>
+    </w:p>
+    <w:p>
+      <w:pPr>
+        <w:spacing w:after="0" w:before="0" w:line="240" w:lineRule="auto"/>
+      </w:pPr>
+      <w:r>
+        <w:rPr>
+          <w:rFonts w:ascii="Consolas" w:hAnsi="Consolas" w:cs="Consolas"/>
+          <w:sz w:val="17"/>
+        </w:rPr>
+        <w:t xml:space="preserve">    printf("Biglietto ridotto\n");</w:t>
+      </w:r>
+    </w:p>
+    <w:p>
+      <w:pPr>
+        <w:spacing w:after="0" w:before="0" w:line="240" w:lineRule="auto"/>
+      </w:pPr>
+      <w:r>
+        <w:rPr>
+          <w:rFonts w:ascii="Consolas" w:hAnsi="Consolas" w:cs="Consolas"/>
+          <w:sz w:val="17"/>
+        </w:rPr>
+        <w:t>}</w:t>
+      </w:r>
+    </w:p>
+    <w:p>
+      <w:pPr>
+        <w:spacing w:after="0" w:before="0" w:line="240" w:lineRule="auto"/>
+      </w:pPr>
+      <w:r>
+        <w:rPr>
+          <w:rFonts w:ascii="Consolas" w:hAnsi="Consolas" w:cs="Consolas"/>
+          <w:sz w:val="17"/>
+        </w:rPr>
+        <w:t>else {</w:t>
+      </w:r>
+    </w:p>
+    <w:p>
+      <w:pPr>
+        <w:spacing w:after="0" w:before="0" w:line="240" w:lineRule="auto"/>
+      </w:pPr>
+      <w:r>
+        <w:rPr>
+          <w:rFonts w:ascii="Consolas" w:hAnsi="Consolas" w:cs="Consolas"/>
+          <w:sz w:val="17"/>
+        </w:rPr>
+        <w:t xml:space="preserve">    printf("Biglietto intero\n");</w:t>
+      </w:r>
+    </w:p>
+    <w:p>
+      <w:pPr>
+        <w:spacing w:after="0" w:before="0" w:line="240" w:lineRule="auto"/>
+      </w:pPr>
+      <w:r>
+        <w:rPr>
+          <w:rFonts w:ascii="Consolas" w:hAnsi="Consolas" w:cs="Consolas"/>
+          <w:sz w:val="17"/>
+        </w:rPr>
+        <w:t>}</w:t>
+      </w:r>
+    </w:p>
+    <w:p/>
+    <w:p>
+      <w:pPr>
+        <w:pStyle w:val="Titolo2"/>
+      </w:pPr>
+      <w:r>
+        <w:rPr>
+          <w:b/>
+          <w:color w:val="E97132"/>
+        </w:rPr>
+        <w:t>Schemi ricorrenti elementari</w:t>
+      </w:r>
+    </w:p>
+    <w:p>
+      <w:r>
+        <w:rPr/>
+        <w:t>Alcuni usi dell'if si ripetono continuamente nei programmi.</w:t>
+      </w:r>
+    </w:p>
+    <w:p>
+      <w:r>
+        <w:rPr>
+          <w:b/>
+        </w:rPr>
+        <w:t>Massimo di due variabili.</w:t>
+      </w:r>
+      <w:r>
+        <w:rPr/>
+        <w:t xml:space="preserve"> Si confrontano a e b e si assegna a max il valore maggiore:</w:t>
+      </w:r>
+    </w:p>
+    <w:p>
+      <w:pPr>
+        <w:spacing w:after="0" w:before="0" w:line="240" w:lineRule="auto"/>
+      </w:pPr>
+      <w:r>
+        <w:rPr>
+          <w:rFonts w:ascii="Consolas" w:hAnsi="Consolas" w:cs="Consolas"/>
+          <w:sz w:val="17"/>
+        </w:rPr>
+        <w:t>int a, b, max;</w:t>
+      </w:r>
+    </w:p>
+    <w:p>
+      <w:pPr>
+        <w:spacing w:after="0" w:before="0" w:line="240" w:lineRule="auto"/>
+      </w:pPr>
+      <w:r>
+        <w:rPr>
+          <w:rFonts w:ascii="Consolas" w:hAnsi="Consolas" w:cs="Consolas"/>
+          <w:sz w:val="17"/>
+        </w:rPr>
+        <w:t>scanf("%d%d", &amp;a, &amp;b);</w:t>
+      </w:r>
+    </w:p>
+    <w:p>
+      <w:pPr>
+        <w:spacing w:after="0" w:before="0" w:line="240" w:lineRule="auto"/>
+      </w:pPr>
+      <w:r>
+        <w:rPr>
+          <w:rFonts w:ascii="Consolas" w:hAnsi="Consolas" w:cs="Consolas"/>
+          <w:sz w:val="17"/>
+        </w:rPr>
+        <w:t>// determina il massimo tra a e b</w:t>
+      </w:r>
+    </w:p>
+    <w:p>
+      <w:pPr>
+        <w:spacing w:after="0" w:before="0" w:line="240" w:lineRule="auto"/>
+      </w:pPr>
+      <w:r>
+        <w:rPr>
+          <w:rFonts w:ascii="Consolas" w:hAnsi="Consolas" w:cs="Consolas"/>
+          <w:sz w:val="17"/>
+        </w:rPr>
+        <w:t>if (a &gt; b) {</w:t>
+      </w:r>
+    </w:p>
+    <w:p>
+      <w:pPr>
+        <w:spacing w:after="0" w:before="0" w:line="240" w:lineRule="auto"/>
+      </w:pPr>
+      <w:r>
+        <w:rPr>
+          <w:rFonts w:ascii="Consolas" w:hAnsi="Consolas" w:cs="Consolas"/>
+          <w:sz w:val="17"/>
+        </w:rPr>
+        <w:t xml:space="preserve">    max = a;</w:t>
+      </w:r>
+    </w:p>
+    <w:p>
+      <w:pPr>
+        <w:spacing w:after="0" w:before="0" w:line="240" w:lineRule="auto"/>
+      </w:pPr>
+      <w:r>
+        <w:rPr>
+          <w:rFonts w:ascii="Consolas" w:hAnsi="Consolas" w:cs="Consolas"/>
+          <w:sz w:val="17"/>
+        </w:rPr>
+        <w:t>}</w:t>
+      </w:r>
+    </w:p>
+    <w:p>
+      <w:pPr>
+        <w:spacing w:after="0" w:before="0" w:line="240" w:lineRule="auto"/>
+      </w:pPr>
+      <w:r>
+        <w:rPr>
+          <w:rFonts w:ascii="Consolas" w:hAnsi="Consolas" w:cs="Consolas"/>
+          <w:sz w:val="17"/>
+        </w:rPr>
+        <w:t>else {</w:t>
+      </w:r>
+    </w:p>
+    <w:p>
+      <w:pPr>
+        <w:spacing w:after="0" w:before="0" w:line="240" w:lineRule="auto"/>
+      </w:pPr>
+      <w:r>
+        <w:rPr>
+          <w:rFonts w:ascii="Consolas" w:hAnsi="Consolas" w:cs="Consolas"/>
+          <w:sz w:val="17"/>
+        </w:rPr>
+        <w:t xml:space="preserve">    max = b;</w:t>
+      </w:r>
+    </w:p>
+    <w:p>
+      <w:pPr>
+        <w:spacing w:after="0" w:before="0" w:line="240" w:lineRule="auto"/>
+      </w:pPr>
+      <w:r>
+        <w:rPr>
+          <w:rFonts w:ascii="Consolas" w:hAnsi="Consolas" w:cs="Consolas"/>
+          <w:sz w:val="17"/>
+        </w:rPr>
+        <w:t>}</w:t>
+      </w:r>
+    </w:p>
+    <w:p>
+      <w:pPr>
+        <w:spacing w:after="0" w:before="0" w:line="240" w:lineRule="auto"/>
+      </w:pPr>
+      <w:r>
+        <w:rPr>
+          <w:rFonts w:ascii="Consolas" w:hAnsi="Consolas" w:cs="Consolas"/>
+          <w:sz w:val="17"/>
+        </w:rPr>
+        <w:t>// qui max contiene il massimo tra a e b</w:t>
+      </w:r>
+    </w:p>
+    <w:p/>
+    <w:p>
+      <w:r>
+        <w:rPr>
+          <w:b/>
+        </w:rPr>
+        <w:t>Validazione dell'input.</w:t>
+      </w:r>
+      <w:r>
+        <w:rPr/>
+        <w:t xml:space="preserve"> Prima di usare i dati letti, si controlla che scanf li abbia letti correttamente, usando il suo valore di ritorno (capitolo 10):</w:t>
+      </w:r>
+    </w:p>
+    <w:p>
+      <w:pPr>
+        <w:spacing w:after="0" w:before="0" w:line="240" w:lineRule="auto"/>
+      </w:pPr>
+      <w:r>
+        <w:rPr>
+          <w:rFonts w:ascii="Consolas" w:hAnsi="Consolas" w:cs="Consolas"/>
+          <w:sz w:val="17"/>
+        </w:rPr>
+        <w:t>int valore;</w:t>
+      </w:r>
+    </w:p>
+    <w:p>
+      <w:pPr>
+        <w:spacing w:after="0" w:before="0" w:line="240" w:lineRule="auto"/>
+      </w:pPr>
+      <w:r>
+        <w:rPr>
+          <w:rFonts w:ascii="Consolas" w:hAnsi="Consolas" w:cs="Consolas"/>
+          <w:sz w:val="17"/>
+        </w:rPr>
+        <w:t>if (scanf("%d", &amp;valore) == 1) {</w:t>
+      </w:r>
+    </w:p>
+    <w:p>
+      <w:pPr>
+        <w:spacing w:after="0" w:before="0" w:line="240" w:lineRule="auto"/>
+      </w:pPr>
+      <w:r>
+        <w:rPr>
+          <w:rFonts w:ascii="Consolas" w:hAnsi="Consolas" w:cs="Consolas"/>
+          <w:sz w:val="17"/>
+        </w:rPr>
+        <w:t xml:space="preserve">    printf("Hai inserito: %d\n", valore);</w:t>
+      </w:r>
+    </w:p>
+    <w:p>
+      <w:pPr>
+        <w:spacing w:after="0" w:before="0" w:line="240" w:lineRule="auto"/>
+      </w:pPr>
+      <w:r>
+        <w:rPr>
+          <w:rFonts w:ascii="Consolas" w:hAnsi="Consolas" w:cs="Consolas"/>
+          <w:sz w:val="17"/>
+        </w:rPr>
+        <w:t>}</w:t>
+      </w:r>
+    </w:p>
+    <w:p>
+      <w:pPr>
+        <w:spacing w:after="0" w:before="0" w:line="240" w:lineRule="auto"/>
+      </w:pPr>
+      <w:r>
+        <w:rPr>
+          <w:rFonts w:ascii="Consolas" w:hAnsi="Consolas" w:cs="Consolas"/>
+          <w:sz w:val="17"/>
+        </w:rPr>
+        <w:t>else {</w:t>
+      </w:r>
+    </w:p>
+    <w:p>
+      <w:pPr>
+        <w:spacing w:after="0" w:before="0" w:line="240" w:lineRule="auto"/>
+      </w:pPr>
+      <w:r>
+        <w:rPr>
+          <w:rFonts w:ascii="Consolas" w:hAnsi="Consolas" w:cs="Consolas"/>
+          <w:sz w:val="17"/>
+        </w:rPr>
+        <w:t xml:space="preserve">    printf("Input non valido\n");</w:t>
+      </w:r>
+    </w:p>
+    <w:p>
+      <w:pPr>
+        <w:spacing w:after="0" w:before="0" w:line="240" w:lineRule="auto"/>
+      </w:pPr>
+      <w:r>
+        <w:rPr>
+          <w:rFonts w:ascii="Consolas" w:hAnsi="Consolas" w:cs="Consolas"/>
+          <w:sz w:val="17"/>
+        </w:rPr>
+        <w:t>}</w:t>
+      </w:r>
+    </w:p>
+    <w:p/>
+    <w:p>
+      <w:r>
+        <w:rPr>
+          <w:b/>
+        </w:rPr>
+        <w:t>Protezione da operazioni illegali.</w:t>
+      </w:r>
+      <w:r>
+        <w:rPr/>
+        <w:t xml:space="preserve"> Per esempio, si evita la divisione per zero controllando il divisore:</w:t>
+      </w:r>
+    </w:p>
+    <w:p>
+      <w:pPr>
+        <w:spacing w:after="0" w:before="0" w:line="240" w:lineRule="auto"/>
+      </w:pPr>
+      <w:r>
+        <w:rPr>
+          <w:rFonts w:ascii="Consolas" w:hAnsi="Consolas" w:cs="Consolas"/>
+          <w:sz w:val="17"/>
+        </w:rPr>
+        <w:t>if (divisore != 0) {</w:t>
+      </w:r>
+    </w:p>
+    <w:p>
+      <w:pPr>
+        <w:spacing w:after="0" w:before="0" w:line="240" w:lineRule="auto"/>
+      </w:pPr>
+      <w:r>
+        <w:rPr>
+          <w:rFonts w:ascii="Consolas" w:hAnsi="Consolas" w:cs="Consolas"/>
+          <w:sz w:val="17"/>
+        </w:rPr>
+        <w:t xml:space="preserve">    printf("Risultato: %d\n", dividendo / divisore);</w:t>
+      </w:r>
+    </w:p>
+    <w:p>
+      <w:pPr>
+        <w:spacing w:after="0" w:before="0" w:line="240" w:lineRule="auto"/>
+      </w:pPr>
+      <w:r>
+        <w:rPr>
+          <w:rFonts w:ascii="Consolas" w:hAnsi="Consolas" w:cs="Consolas"/>
+          <w:sz w:val="17"/>
+        </w:rPr>
+        <w:t>}</w:t>
+      </w:r>
+    </w:p>
+    <w:p>
+      <w:pPr>
+        <w:spacing w:after="0" w:before="0" w:line="240" w:lineRule="auto"/>
+      </w:pPr>
+      <w:r>
+        <w:rPr>
+          <w:rFonts w:ascii="Consolas" w:hAnsi="Consolas" w:cs="Consolas"/>
+          <w:sz w:val="17"/>
+        </w:rPr>
+        <w:t>else {</w:t>
+      </w:r>
+    </w:p>
+    <w:p>
+      <w:pPr>
+        <w:spacing w:after="0" w:before="0" w:line="240" w:lineRule="auto"/>
+      </w:pPr>
+      <w:r>
+        <w:rPr>
+          <w:rFonts w:ascii="Consolas" w:hAnsi="Consolas" w:cs="Consolas"/>
+          <w:sz w:val="17"/>
+        </w:rPr>
+        <w:t xml:space="preserve">    printf("Errore: divisione per zero!\n");</w:t>
+      </w:r>
+    </w:p>
+    <w:p>
+      <w:pPr>
+        <w:spacing w:after="0" w:before="0" w:line="240" w:lineRule="auto"/>
+      </w:pPr>
+      <w:r>
+        <w:rPr>
+          <w:rFonts w:ascii="Consolas" w:hAnsi="Consolas" w:cs="Consolas"/>
+          <w:sz w:val="17"/>
+        </w:rPr>
+        <w:t>}</w:t>
+      </w:r>
+    </w:p>
+    <w:p/>
+    <w:p>
+      <w:r>
+        <w:rPr>
+          <w:b/>
+        </w:rPr>
+        <w:t>Controllo che un valore stia in un intervallo.</w:t>
+      </w:r>
+      <w:r>
+        <w:rPr/>
+        <w:t xml:space="preserve"> Si combinano la lettura riuscita e il confronto sull'intervallo (capitolo 18); grazie alla cortocircuitazione, se la lettura è fallita la temperatura non viene nemmeno confrontata:</w:t>
+      </w:r>
+    </w:p>
+    <w:p>
+      <w:pPr>
+        <w:spacing w:after="0" w:before="0" w:line="240" w:lineRule="auto"/>
+      </w:pPr>
+      <w:r>
+        <w:rPr>
+          <w:rFonts w:ascii="Consolas" w:hAnsi="Consolas" w:cs="Consolas"/>
+          <w:sz w:val="17"/>
+        </w:rPr>
+        <w:t>float temperatura;</w:t>
+      </w:r>
+    </w:p>
+    <w:p>
+      <w:pPr>
+        <w:spacing w:after="0" w:before="0" w:line="240" w:lineRule="auto"/>
+      </w:pPr>
+      <w:r>
+        <w:rPr>
+          <w:rFonts w:ascii="Consolas" w:hAnsi="Consolas" w:cs="Consolas"/>
+          <w:sz w:val="17"/>
+        </w:rPr>
+        <w:t>bool inputOk = scanf("%f", &amp;temperatura) == 1;</w:t>
+      </w:r>
+    </w:p>
+    <w:p>
+      <w:pPr>
+        <w:spacing w:after="0" w:before="0" w:line="240" w:lineRule="auto"/>
+      </w:pPr>
+      <w:r>
+        <w:rPr>
+          <w:rFonts w:ascii="Consolas" w:hAnsi="Consolas" w:cs="Consolas"/>
+          <w:sz w:val="17"/>
+        </w:rPr>
+        <w:t>// 0 &lt;= temperatura &lt;= 100</w:t>
+      </w:r>
+    </w:p>
+    <w:p>
+      <w:pPr>
+        <w:spacing w:after="0" w:before="0" w:line="240" w:lineRule="auto"/>
+      </w:pPr>
+      <w:r>
+        <w:rPr>
+          <w:rFonts w:ascii="Consolas" w:hAnsi="Consolas" w:cs="Consolas"/>
+          <w:sz w:val="17"/>
+        </w:rPr>
+        <w:t>if (inputOk &amp;&amp; 0 &lt;= temperatura &amp;&amp; temperatura &lt;= 100) {</w:t>
+      </w:r>
+    </w:p>
+    <w:p>
+      <w:pPr>
+        <w:spacing w:after="0" w:before="0" w:line="240" w:lineRule="auto"/>
+      </w:pPr>
+      <w:r>
+        <w:rPr>
+          <w:rFonts w:ascii="Consolas" w:hAnsi="Consolas" w:cs="Consolas"/>
+          <w:sz w:val="17"/>
+        </w:rPr>
+        <w:t xml:space="preserve">    printf("Temperatura entro i limiti\n");</w:t>
+      </w:r>
+    </w:p>
+    <w:p>
+      <w:pPr>
+        <w:spacing w:after="0" w:before="0" w:line="240" w:lineRule="auto"/>
+      </w:pPr>
+      <w:r>
+        <w:rPr>
+          <w:rFonts w:ascii="Consolas" w:hAnsi="Consolas" w:cs="Consolas"/>
+          <w:sz w:val="17"/>
+        </w:rPr>
+        <w:t>}</w:t>
+      </w:r>
+    </w:p>
+    <w:p>
+      <w:pPr>
+        <w:spacing w:after="0" w:before="0" w:line="240" w:lineRule="auto"/>
+      </w:pPr>
+      <w:r>
+        <w:rPr>
+          <w:rFonts w:ascii="Consolas" w:hAnsi="Consolas" w:cs="Consolas"/>
+          <w:sz w:val="17"/>
+        </w:rPr>
+        <w:t>else {</w:t>
+      </w:r>
+    </w:p>
+    <w:p>
+      <w:pPr>
+        <w:spacing w:after="0" w:before="0" w:line="240" w:lineRule="auto"/>
+      </w:pPr>
+      <w:r>
+        <w:rPr>
+          <w:rFonts w:ascii="Consolas" w:hAnsi="Consolas" w:cs="Consolas"/>
+          <w:sz w:val="17"/>
+        </w:rPr>
+        <w:t xml:space="preserve">    printf("Temperatura fuori intervallo o lettura errata\n");</w:t>
+      </w:r>
+    </w:p>
+    <w:p>
+      <w:pPr>
+        <w:spacing w:after="0" w:before="0" w:line="240" w:lineRule="auto"/>
+      </w:pPr>
+      <w:r>
+        <w:rPr>
+          <w:rFonts w:ascii="Consolas" w:hAnsi="Consolas" w:cs="Consolas"/>
+          <w:sz w:val="17"/>
+        </w:rPr>
+        <w:t>}</w:t>
+      </w:r>
+    </w:p>
+    <w:p/>
     <w:sectPr>
       <w:pgSz w:w="11906" w:h="16838"/>
       <w:pgMar w:top="1417" w:right="1134" w:bottom="1134" w:left="1134" w:header="708" w:footer="708" w:gutter="0"/>

</xml_diff>